<commit_message>
feat: implement DOCX to PDF conversion and enhance ISCC export functionality
- Added LibreOffice installation in Dockerfile for document conversion.
- Introduced a new utility for converting DOCX files to PDF using LibreOffice.
- Enhanced ISCC export API to support PDF generation from merged Word documents.
- Updated package.json and package-lock.json to include new dependencies for document processing.
- Improved error handling and logging in the ISCC export process for better reliability.
</commit_message>
<xml_diff>
--- a/template/ISCC.docx
+++ b/template/ISCC.docx
@@ -1,6 +1,6 @@
 
 <file path=word/document.xml><?xml version="1.0" encoding="utf-8"?>
-<w:document xmlns:wpc="http://schemas.microsoft.com/office/word/2010/wordprocessingCanvas" xmlns:cx="http://schemas.microsoft.com/office/drawing/2014/chartex" xmlns:cx1="http://schemas.microsoft.com/office/drawing/2015/9/8/chartex" xmlns:cx2="http://schemas.microsoft.com/office/drawing/2015/10/21/chartex" xmlns:cx3="http://schemas.microsoft.com/office/drawing/2016/5/9/chartex" xmlns:cx4="http://schemas.microsoft.com/office/drawing/2016/5/10/chartex" xmlns:cx5="http://schemas.microsoft.com/office/drawing/2016/5/11/chartex" xmlns:cx6="http://schemas.microsoft.com/office/drawing/2016/5/12/chartex" xmlns:cx7="http://schemas.microsoft.com/office/drawing/2016/5/13/chartex" xmlns:cx8="http://schemas.microsoft.com/office/drawing/2016/5/14/chartex" xmlns:mc="http://schemas.openxmlformats.org/markup-compatibility/2006" xmlns:aink="http://schemas.microsoft.com/office/drawing/2016/ink" xmlns:am3d="http://schemas.microsoft.com/office/drawing/2017/model3d" xmlns:o="urn:schemas-microsoft-com:office:office" xmlns:oel="http://schemas.microsoft.com/office/2019/extlst" xmlns:r="http://schemas.openxmlformats.org/officeDocument/2006/relationships" xmlns:m="http://schemas.openxmlformats.org/officeDocument/2006/math" xmlns:v="urn:schemas-microsoft-com:vml" xmlns:wp14="http://schemas.microsoft.com/office/word/2010/wordprocessingDrawing" xmlns:wp="http://schemas.openxmlformats.org/drawingml/2006/wordprocessingDrawing" xmlns:w10="urn:schemas-microsoft-com:office:word" xmlns:w="http://schemas.openxmlformats.org/wordprocessingml/2006/main" xmlns:w14="http://schemas.microsoft.com/office/word/2010/wordml" xmlns:w15="http://schemas.microsoft.com/office/word/2012/wordml" xmlns:w16cex="http://schemas.microsoft.com/office/word/2018/wordml/cex" xmlns:w16cid="http://schemas.microsoft.com/office/word/2016/wordml/cid" xmlns:w16="http://schemas.microsoft.com/office/word/2018/wordml" xmlns:w16du="http://schemas.microsoft.com/office/word/2023/wordml/word16du" xmlns:w16sdtdh="http://schemas.microsoft.com/office/word/2020/wordml/sdtdatahash" xmlns:w16sdtfl="http://schemas.microsoft.com/office/word/2024/wordml/sdtformatlock" xmlns:w16se="http://schemas.microsoft.com/office/word/2015/wordml/symex" xmlns:wpg="http://schemas.microsoft.com/office/word/2010/wordprocessingGroup" xmlns:wpi="http://schemas.microsoft.com/office/word/2010/wordprocessingInk" xmlns:wne="http://schemas.microsoft.com/office/word/2006/wordml" xmlns:wps="http://schemas.microsoft.com/office/word/2010/wordprocessingShape" xmlns:a="http://schemas.openxmlformats.org/drawingml/2006/main" xmlns:pic="http://schemas.openxmlformats.org/drawingml/2006/picture" mc:Ignorable="w14 w15 w16se w16cid w16 w16cex w16sdtdh w16sdtfl w16du wp14">
+<w:document xmlns:wpc="http://schemas.microsoft.com/office/word/2010/wordprocessingCanvas" xmlns:cx="http://schemas.microsoft.com/office/drawing/2014/chartex" xmlns:cx1="http://schemas.microsoft.com/office/drawing/2015/9/8/chartex" xmlns:cx2="http://schemas.microsoft.com/office/drawing/2015/10/21/chartex" xmlns:cx3="http://schemas.microsoft.com/office/drawing/2016/5/9/chartex" xmlns:cx4="http://schemas.microsoft.com/office/drawing/2016/5/10/chartex" xmlns:cx5="http://schemas.microsoft.com/office/drawing/2016/5/11/chartex" xmlns:cx6="http://schemas.microsoft.com/office/drawing/2016/5/12/chartex" xmlns:cx7="http://schemas.microsoft.com/office/drawing/2016/5/13/chartex" xmlns:cx8="http://schemas.microsoft.com/office/drawing/2016/5/14/chartex" xmlns:mc="http://schemas.openxmlformats.org/markup-compatibility/2006" xmlns:aink="http://schemas.microsoft.com/office/drawing/2016/ink" xmlns:am3d="http://schemas.microsoft.com/office/drawing/2017/model3d" xmlns:o="urn:schemas-microsoft-com:office:office" xmlns:oel="http://schemas.microsoft.com/office/2019/extlst" xmlns:r="http://schemas.openxmlformats.org/officeDocument/2006/relationships" xmlns:m="http://schemas.openxmlformats.org/officeDocument/2006/math" xmlns:v="urn:schemas-microsoft-com:vml" xmlns:wp14="http://schemas.microsoft.com/office/word/2010/wordprocessingDrawing" xmlns:wp="http://schemas.openxmlformats.org/drawingml/2006/wordprocessingDrawing" xmlns:w10="urn:schemas-microsoft-com:office:word" xmlns:w="http://schemas.openxmlformats.org/wordprocessingml/2006/main" xmlns:w14="http://schemas.microsoft.com/office/word/2010/wordml" xmlns:w15="http://schemas.microsoft.com/office/word/2012/wordml" xmlns:w16cex="http://schemas.microsoft.com/office/word/2018/wordml/cex" xmlns:w16cid="http://schemas.microsoft.com/office/word/2016/wordml/cid" xmlns:w16="http://schemas.microsoft.com/office/word/2018/wordml" xmlns:w16du="http://schemas.microsoft.com/office/word/2023/wordml/word16du" xmlns:w16sdtdh="http://schemas.microsoft.com/office/word/2020/wordml/sdtdatahash" xmlns:w16sdtfl="http://schemas.microsoft.com/office/word/2024/wordml/sdtformatlock" xmlns:w16se="http://schemas.microsoft.com/office/word/2015/wordml/symex" xmlns:wpg="http://schemas.microsoft.com/office/word/2010/wordprocessingGroup" xmlns:wpi="http://schemas.microsoft.com/office/word/2010/wordprocessingInk" xmlns:wne="http://schemas.microsoft.com/office/word/2006/wordml" xmlns:wps="http://schemas.microsoft.com/office/word/2010/wordprocessingShape" mc:Ignorable="w14 w15 w16se w16cid w16 w16cex w16sdtdh w16sdtfl w16du wp14">
   <w:body>
     <w:tbl>
       <w:tblPr>
@@ -8,12 +8,12 @@
         <w:tblW w:w="10579" w:type="dxa"/>
         <w:tblInd w:w="102" w:type="dxa"/>
         <w:tblBorders>
-          <w:top w:val="single" w:color="5F5F5F" w:sz="8" w:space="0"/>
-          <w:left w:val="single" w:color="5F5F5F" w:sz="8" w:space="0"/>
-          <w:bottom w:val="single" w:color="5F5F5F" w:sz="8" w:space="0"/>
-          <w:right w:val="single" w:color="5F5F5F" w:sz="8" w:space="0"/>
-          <w:insideH w:val="single" w:color="5F5F5F" w:sz="8" w:space="0"/>
-          <w:insideV w:val="single" w:color="5F5F5F" w:sz="8" w:space="0"/>
+          <w:top w:val="single" w:sz="8" w:space="0" w:color="5F5F5F"/>
+          <w:left w:val="single" w:sz="8" w:space="0" w:color="5F5F5F"/>
+          <w:bottom w:val="single" w:sz="8" w:space="0" w:color="5F5F5F"/>
+          <w:right w:val="single" w:sz="8" w:space="0" w:color="5F5F5F"/>
+          <w:insideH w:val="single" w:sz="8" w:space="0" w:color="5F5F5F"/>
+          <w:insideV w:val="single" w:sz="8" w:space="0" w:color="5F5F5F"/>
         </w:tblBorders>
         <w:shd w:val="clear" w:color="auto" w:fill="5F5F5F"/>
         <w:tblLayout w:type="fixed"/>
@@ -23,7 +23,7 @@
         <w:gridCol w:w="5990"/>
         <w:gridCol w:w="4589"/>
       </w:tblGrid>
-      <w:tr xmlns:wp14="http://schemas.microsoft.com/office/word/2010/wordml" wp14:textId="77777777">
+      <w:tr>
         <w:trPr>
           <w:trHeight w:val="505"/>
         </w:trPr>
@@ -35,19 +35,19 @@
             </w:tcBorders>
             <w:shd w:val="clear" w:color="auto" w:fill="5F5F5F"/>
           </w:tcPr>
-          <w:p wp14:textId="77777777">
+          <w:p>
             <w:pPr>
               <w:spacing w:before="50" w:line="209" w:lineRule="auto"/>
               <w:ind w:left="102" w:right="2966" w:firstLine="12"/>
               <w:rPr>
-                <w:rFonts w:ascii="Trebuchet MS" w:hAnsi="Trebuchet MS" w:eastAsia="Trebuchet MS" w:cs="Trebuchet MS"/>
+                <w:rFonts w:ascii="Trebuchet MS" w:eastAsia="Trebuchet MS" w:hAnsi="Trebuchet MS" w:cs="Trebuchet MS"/>
                 <w:sz w:val="22"/>
                 <w:szCs w:val="22"/>
               </w:rPr>
             </w:pPr>
             <w:r>
               <w:rPr>
-                <w:rFonts w:ascii="Trebuchet MS" w:hAnsi="Trebuchet MS" w:eastAsia="Trebuchet MS" w:cs="Trebuchet MS"/>
+                <w:rFonts w:ascii="Trebuchet MS" w:eastAsia="Trebuchet MS" w:hAnsi="Trebuchet MS" w:cs="Trebuchet MS"/>
                 <w:b/>
                 <w:bCs/>
                 <w:color w:val="FFFFFF"/>
@@ -59,7 +59,7 @@
             </w:r>
             <w:r>
               <w:rPr>
-                <w:rFonts w:ascii="Trebuchet MS" w:hAnsi="Trebuchet MS" w:eastAsia="Trebuchet MS" w:cs="Trebuchet MS"/>
+                <w:rFonts w:ascii="Trebuchet MS" w:eastAsia="Trebuchet MS" w:hAnsi="Trebuchet MS" w:cs="Trebuchet MS"/>
                 <w:color w:val="FFFFFF"/>
                 <w:spacing w:val="8"/>
                 <w:sz w:val="22"/>
@@ -69,7 +69,7 @@
             </w:r>
             <w:r>
               <w:rPr>
-                <w:rFonts w:ascii="Trebuchet MS" w:hAnsi="Trebuchet MS" w:eastAsia="Trebuchet MS" w:cs="Trebuchet MS"/>
+                <w:rFonts w:ascii="Trebuchet MS" w:eastAsia="Trebuchet MS" w:hAnsi="Trebuchet MS" w:cs="Trebuchet MS"/>
                 <w:b/>
                 <w:bCs/>
                 <w:color w:val="FFFFFF"/>
@@ -81,7 +81,7 @@
             </w:r>
             <w:r>
               <w:rPr>
-                <w:rFonts w:ascii="Trebuchet MS" w:hAnsi="Trebuchet MS" w:eastAsia="Trebuchet MS" w:cs="Trebuchet MS"/>
+                <w:rFonts w:ascii="Trebuchet MS" w:eastAsia="Trebuchet MS" w:hAnsi="Trebuchet MS" w:cs="Trebuchet MS"/>
                 <w:color w:val="FFFFFF"/>
                 <w:spacing w:val="8"/>
                 <w:sz w:val="22"/>
@@ -91,7 +91,7 @@
             </w:r>
             <w:r>
               <w:rPr>
-                <w:rFonts w:ascii="Trebuchet MS" w:hAnsi="Trebuchet MS" w:eastAsia="Trebuchet MS" w:cs="Trebuchet MS"/>
+                <w:rFonts w:ascii="Trebuchet MS" w:eastAsia="Trebuchet MS" w:hAnsi="Trebuchet MS" w:cs="Trebuchet MS"/>
                 <w:b/>
                 <w:bCs/>
                 <w:color w:val="FFFFFF"/>
@@ -103,7 +103,7 @@
             </w:r>
             <w:r>
               <w:rPr>
-                <w:rFonts w:ascii="Trebuchet MS" w:hAnsi="Trebuchet MS" w:eastAsia="Trebuchet MS" w:cs="Trebuchet MS"/>
+                <w:rFonts w:ascii="Trebuchet MS" w:eastAsia="Trebuchet MS" w:hAnsi="Trebuchet MS" w:cs="Trebuchet MS"/>
                 <w:color w:val="FFFFFF"/>
                 <w:spacing w:val="2"/>
                 <w:sz w:val="22"/>
@@ -113,7 +113,7 @@
             </w:r>
             <w:r>
               <w:rPr>
-                <w:rFonts w:ascii="Trebuchet MS" w:hAnsi="Trebuchet MS" w:eastAsia="Trebuchet MS" w:cs="Trebuchet MS"/>
+                <w:rFonts w:ascii="Trebuchet MS" w:eastAsia="Trebuchet MS" w:hAnsi="Trebuchet MS" w:cs="Trebuchet MS"/>
                 <w:b/>
                 <w:bCs/>
                 <w:color w:val="FFFFFF"/>
@@ -125,7 +125,7 @@
             </w:r>
             <w:r>
               <w:rPr>
-                <w:rFonts w:ascii="Trebuchet MS" w:hAnsi="Trebuchet MS" w:eastAsia="Trebuchet MS" w:cs="Trebuchet MS"/>
+                <w:rFonts w:ascii="Trebuchet MS" w:eastAsia="Trebuchet MS" w:hAnsi="Trebuchet MS" w:cs="Trebuchet MS"/>
                 <w:color w:val="FFFFFF"/>
                 <w:spacing w:val="7"/>
                 <w:sz w:val="22"/>
@@ -135,7 +135,7 @@
             </w:r>
             <w:r>
               <w:rPr>
-                <w:rFonts w:ascii="Trebuchet MS" w:hAnsi="Trebuchet MS" w:eastAsia="Trebuchet MS" w:cs="Trebuchet MS"/>
+                <w:rFonts w:ascii="Trebuchet MS" w:eastAsia="Trebuchet MS" w:hAnsi="Trebuchet MS" w:cs="Trebuchet MS"/>
                 <w:b/>
                 <w:bCs/>
                 <w:color w:val="FFFFFF"/>
@@ -147,7 +147,7 @@
             </w:r>
             <w:r>
               <w:rPr>
-                <w:rFonts w:ascii="Trebuchet MS" w:hAnsi="Trebuchet MS" w:eastAsia="Trebuchet MS" w:cs="Trebuchet MS"/>
+                <w:rFonts w:ascii="Trebuchet MS" w:eastAsia="Trebuchet MS" w:hAnsi="Trebuchet MS" w:cs="Trebuchet MS"/>
                 <w:color w:val="FFFFFF"/>
                 <w:spacing w:val="7"/>
                 <w:sz w:val="22"/>
@@ -157,7 +157,7 @@
             </w:r>
             <w:r>
               <w:rPr>
-                <w:rFonts w:ascii="Trebuchet MS" w:hAnsi="Trebuchet MS" w:eastAsia="Trebuchet MS" w:cs="Trebuchet MS"/>
+                <w:rFonts w:ascii="Trebuchet MS" w:eastAsia="Trebuchet MS" w:hAnsi="Trebuchet MS" w:cs="Trebuchet MS"/>
                 <w:b/>
                 <w:bCs/>
                 <w:color w:val="FFFFFF"/>
@@ -169,7 +169,7 @@
             </w:r>
             <w:r>
               <w:rPr>
-                <w:rFonts w:ascii="Trebuchet MS" w:hAnsi="Trebuchet MS" w:eastAsia="Trebuchet MS" w:cs="Trebuchet MS"/>
+                <w:rFonts w:ascii="Trebuchet MS" w:eastAsia="Trebuchet MS" w:hAnsi="Trebuchet MS" w:cs="Trebuchet MS"/>
                 <w:color w:val="FFFFFF"/>
                 <w:spacing w:val="7"/>
                 <w:sz w:val="22"/>
@@ -179,7 +179,7 @@
             </w:r>
             <w:r>
               <w:rPr>
-                <w:rFonts w:ascii="Trebuchet MS" w:hAnsi="Trebuchet MS" w:eastAsia="Trebuchet MS" w:cs="Trebuchet MS"/>
+                <w:rFonts w:ascii="Trebuchet MS" w:eastAsia="Trebuchet MS" w:hAnsi="Trebuchet MS" w:cs="Trebuchet MS"/>
                 <w:b/>
                 <w:bCs/>
                 <w:color w:val="FFFFFF"/>
@@ -199,20 +199,20 @@
             </w:tcBorders>
             <w:shd w:val="clear" w:color="auto" w:fill="5F5F5F"/>
           </w:tcPr>
-          <w:p wp14:textId="77777777">
+          <w:p>
             <w:pPr>
               <w:spacing w:before="175" w:line="197" w:lineRule="auto"/>
               <w:ind w:left="2969"/>
               <w:outlineLvl w:val="0"/>
               <w:rPr>
-                <w:rFonts w:ascii="Trebuchet MS" w:hAnsi="Trebuchet MS" w:eastAsia="Trebuchet MS" w:cs="Trebuchet MS"/>
+                <w:rFonts w:ascii="Trebuchet MS" w:eastAsia="Trebuchet MS" w:hAnsi="Trebuchet MS" w:cs="Trebuchet MS"/>
                 <w:sz w:val="22"/>
                 <w:szCs w:val="22"/>
               </w:rPr>
             </w:pPr>
             <w:r>
               <w:rPr>
-                <w:rFonts w:ascii="Trebuchet MS" w:hAnsi="Trebuchet MS" w:eastAsia="Trebuchet MS" w:cs="Trebuchet MS"/>
+                <w:rFonts w:ascii="Trebuchet MS" w:eastAsia="Trebuchet MS" w:hAnsi="Trebuchet MS" w:cs="Trebuchet MS"/>
                 <w:b/>
                 <w:bCs/>
                 <w:color w:val="FFFFFF"/>
@@ -224,7 +224,7 @@
             </w:r>
             <w:r>
               <w:rPr>
-                <w:rFonts w:ascii="Trebuchet MS" w:hAnsi="Trebuchet MS" w:eastAsia="Trebuchet MS" w:cs="Trebuchet MS"/>
+                <w:rFonts w:ascii="Trebuchet MS" w:eastAsia="Trebuchet MS" w:hAnsi="Trebuchet MS" w:cs="Trebuchet MS"/>
                 <w:color w:val="FFFFFF"/>
                 <w:spacing w:val="3"/>
                 <w:sz w:val="22"/>
@@ -234,7 +234,7 @@
             </w:r>
             <w:r>
               <w:rPr>
-                <w:rFonts w:ascii="Trebuchet MS" w:hAnsi="Trebuchet MS" w:eastAsia="Trebuchet MS" w:cs="Trebuchet MS"/>
+                <w:rFonts w:ascii="Trebuchet MS" w:eastAsia="Trebuchet MS" w:hAnsi="Trebuchet MS" w:cs="Trebuchet MS"/>
                 <w:b/>
                 <w:bCs/>
                 <w:color w:val="FFFFFF"/>
@@ -246,7 +246,7 @@
             </w:r>
             <w:r>
               <w:rPr>
-                <w:rFonts w:ascii="Trebuchet MS" w:hAnsi="Trebuchet MS" w:eastAsia="Trebuchet MS" w:cs="Trebuchet MS"/>
+                <w:rFonts w:ascii="Trebuchet MS" w:eastAsia="Trebuchet MS" w:hAnsi="Trebuchet MS" w:cs="Trebuchet MS"/>
                 <w:color w:val="FFFFFF"/>
                 <w:spacing w:val="3"/>
                 <w:sz w:val="22"/>
@@ -256,7 +256,7 @@
             </w:r>
             <w:r>
               <w:rPr>
-                <w:rFonts w:ascii="Trebuchet MS" w:hAnsi="Trebuchet MS" w:eastAsia="Trebuchet MS" w:cs="Trebuchet MS"/>
+                <w:rFonts w:ascii="Trebuchet MS" w:eastAsia="Trebuchet MS" w:hAnsi="Trebuchet MS" w:cs="Trebuchet MS"/>
                 <w:b/>
                 <w:bCs/>
                 <w:color w:val="FFFFFF"/>
@@ -270,7 +270,7 @@
         </w:tc>
       </w:tr>
     </w:tbl>
-    <w:p xmlns:wp14="http://schemas.microsoft.com/office/word/2010/wordml" wp14:textId="77777777">
+    <w:p>
       <w:pPr>
         <w:spacing w:before="23"/>
       </w:pPr>
@@ -281,12 +281,12 @@
         <w:tblW w:w="10609" w:type="dxa"/>
         <w:tblInd w:w="102" w:type="dxa"/>
         <w:tblBorders>
-          <w:top w:val="single" w:color="000000" w:sz="4" w:space="0"/>
-          <w:left w:val="single" w:color="000000" w:sz="4" w:space="0"/>
-          <w:bottom w:val="single" w:color="000000" w:sz="4" w:space="0"/>
-          <w:right w:val="single" w:color="000000" w:sz="4" w:space="0"/>
-          <w:insideH w:val="single" w:color="000000" w:sz="4" w:space="0"/>
-          <w:insideV w:val="single" w:color="000000" w:sz="4" w:space="0"/>
+          <w:top w:val="single" w:sz="4" w:space="0" w:color="000000"/>
+          <w:left w:val="single" w:sz="4" w:space="0" w:color="000000"/>
+          <w:bottom w:val="single" w:sz="4" w:space="0" w:color="000000"/>
+          <w:right w:val="single" w:sz="4" w:space="0" w:color="000000"/>
+          <w:insideH w:val="single" w:sz="4" w:space="0" w:color="000000"/>
+          <w:insideV w:val="single" w:sz="4" w:space="0" w:color="000000"/>
         </w:tblBorders>
         <w:tblLayout w:type="fixed"/>
         <w:tblLook w:val="04A0" w:firstRow="1" w:lastRow="0" w:firstColumn="1" w:lastColumn="0" w:noHBand="0" w:noVBand="1"/>
@@ -299,7 +299,7 @@
         <w:gridCol w:w="781"/>
         <w:gridCol w:w="1277"/>
       </w:tblGrid>
-      <w:tr xmlns:wp14="http://schemas.microsoft.com/office/word/2010/wordml" wp14:textId="77777777">
+      <w:tr>
         <w:trPr>
           <w:trHeight w:val="450"/>
         </w:trPr>
@@ -307,9 +307,8 @@
           <w:tcPr>
             <w:tcW w:w="3759" w:type="dxa"/>
             <w:gridSpan w:val="2"/>
-            <w:tcMar/>
           </w:tcPr>
-          <w:p wp14:textId="77777777">
+          <w:p>
             <w:pPr>
               <w:pStyle w:val="TableText"/>
               <w:spacing w:before="159" w:line="196" w:lineRule="auto"/>
@@ -357,15 +356,13 @@
           <w:tcPr>
             <w:tcW w:w="6850" w:type="dxa"/>
             <w:gridSpan w:val="4"/>
-            <w:tcMar/>
             <w:vAlign w:val="center"/>
           </w:tcPr>
-          <w:p wp14:textId="2C4838A8">
+          <w:p>
             <w:pPr>
               <w:pStyle w:val="TableText"/>
-              <w:jc w:val="left"/>
-              <w:rPr>
-                <w:rFonts w:eastAsia="SimSun"/>
+              <w:rPr>
+                <w:rFonts w:eastAsia="宋体"/>
                 <w:color w:val="auto"/>
                 <w:sz w:val="21"/>
                 <w:szCs w:val="21"/>
@@ -374,7 +371,7 @@
             </w:pPr>
             <w:r>
               <w:rPr>
-                <w:rFonts w:eastAsia="SimSun"/>
+                <w:rFonts w:eastAsia="宋体"/>
                 <w:sz w:val="21"/>
                 <w:szCs w:val="21"/>
                 <w:lang w:eastAsia="zh-CN"/>
@@ -383,59 +380,37 @@
             </w:r>
             <w:r>
               <w:rPr>
-                <w:rFonts w:ascii="Consolas" w:hAnsi="Consolas" w:eastAsia="Consolas" w:cs="Consolas"/>
-                <w:b w:val="0"/>
-                <w:bCs w:val="0"/>
-                <w:i w:val="0"/>
-                <w:iCs w:val="0"/>
-                <w:caps w:val="0"/>
-                <w:smallCaps w:val="0"/>
-                <w:noProof w:val="0"/>
+                <w:rFonts w:ascii="Consolas" w:eastAsia="Consolas" w:hAnsi="Consolas" w:cs="Consolas"/>
                 <w:color w:val="auto"/>
                 <w:sz w:val="19"/>
                 <w:szCs w:val="19"/>
-                <w:lang w:val="en-US"/>
               </w:rPr>
               <w:t>{</w:t>
             </w:r>
-            <w:r>
-              <w:rPr>
-                <w:rFonts w:ascii="Consolas" w:hAnsi="Consolas" w:eastAsia="Consolas" w:cs="Consolas"/>
-                <w:b w:val="0"/>
-                <w:bCs w:val="0"/>
-                <w:i w:val="0"/>
-                <w:iCs w:val="0"/>
-                <w:caps w:val="0"/>
-                <w:smallCaps w:val="0"/>
-                <w:noProof w:val="0"/>
+            <w:proofErr w:type="spellStart"/>
+            <w:r>
+              <w:rPr>
+                <w:rFonts w:ascii="Consolas" w:eastAsia="Consolas" w:hAnsi="Consolas" w:cs="Consolas"/>
                 <w:color w:val="auto"/>
                 <w:sz w:val="19"/>
                 <w:szCs w:val="19"/>
-                <w:lang w:val="en-US"/>
               </w:rPr>
               <w:t>storeName</w:t>
             </w:r>
-            <w:r>
-              <w:rPr>
-                <w:rFonts w:ascii="Consolas" w:hAnsi="Consolas" w:eastAsia="Consolas" w:cs="Consolas"/>
-                <w:b w:val="0"/>
-                <w:bCs w:val="0"/>
-                <w:i w:val="0"/>
-                <w:iCs w:val="0"/>
-                <w:caps w:val="0"/>
-                <w:smallCaps w:val="0"/>
-                <w:noProof w:val="0"/>
+            <w:proofErr w:type="spellEnd"/>
+            <w:r>
+              <w:rPr>
+                <w:rFonts w:ascii="Consolas" w:eastAsia="Consolas" w:hAnsi="Consolas" w:cs="Consolas"/>
                 <w:color w:val="auto"/>
                 <w:sz w:val="19"/>
                 <w:szCs w:val="19"/>
-                <w:lang w:val="en-US"/>
               </w:rPr>
               <w:t>}</w:t>
             </w:r>
           </w:p>
         </w:tc>
       </w:tr>
-      <w:tr xmlns:wp14="http://schemas.microsoft.com/office/word/2010/wordml" wp14:textId="77777777">
+      <w:tr>
         <w:trPr>
           <w:trHeight w:val="450"/>
         </w:trPr>
@@ -443,9 +418,8 @@
           <w:tcPr>
             <w:tcW w:w="3759" w:type="dxa"/>
             <w:gridSpan w:val="2"/>
-            <w:tcMar/>
           </w:tcPr>
-          <w:p wp14:textId="77777777">
+          <w:p>
             <w:pPr>
               <w:pStyle w:val="TableText"/>
               <w:spacing w:before="154" w:line="237" w:lineRule="auto"/>
@@ -463,31 +437,21 @@
           <w:tcPr>
             <w:tcW w:w="6850" w:type="dxa"/>
             <w:gridSpan w:val="4"/>
-            <w:tcMar/>
             <w:vAlign w:val="center"/>
           </w:tcPr>
-          <w:p wp14:textId="1225FB5A">
+          <w:p>
             <w:pPr>
               <w:pStyle w:val="TableText"/>
-              <w:jc w:val="left"/>
-              <w:rPr>
-                <w:rFonts w:ascii="Consolas" w:hAnsi="Consolas" w:eastAsia="Consolas" w:cs="Consolas"/>
-                <w:b w:val="0"/>
-                <w:bCs w:val="0"/>
-                <w:i w:val="0"/>
-                <w:iCs w:val="0"/>
-                <w:caps w:val="0"/>
-                <w:smallCaps w:val="0"/>
-                <w:noProof w:val="0"/>
+              <w:rPr>
+                <w:rFonts w:ascii="Consolas" w:eastAsia="Consolas" w:hAnsi="Consolas" w:cs="Consolas"/>
                 <w:color w:val="auto"/>
                 <w:sz w:val="19"/>
                 <w:szCs w:val="19"/>
-                <w:lang w:val="en-US"/>
               </w:rPr>
             </w:pPr>
             <w:r>
               <w:rPr>
-                <w:rFonts w:eastAsia="SimSun"/>
+                <w:rFonts w:eastAsia="宋体"/>
                 <w:color w:val="auto"/>
                 <w:sz w:val="21"/>
                 <w:szCs w:val="21"/>
@@ -497,25 +461,17 @@
             </w:r>
             <w:r>
               <w:rPr>
-                <w:rFonts w:ascii="Consolas" w:hAnsi="Consolas" w:eastAsia="Consolas" w:cs="Consolas"/>
-                <w:b w:val="0"/>
-                <w:bCs w:val="0"/>
-                <w:i w:val="0"/>
-                <w:iCs w:val="0"/>
-                <w:caps w:val="0"/>
-                <w:smallCaps w:val="0"/>
-                <w:noProof w:val="0"/>
+                <w:rFonts w:ascii="Consolas" w:eastAsia="Consolas" w:hAnsi="Consolas" w:cs="Consolas"/>
                 <w:color w:val="auto"/>
                 <w:sz w:val="19"/>
                 <w:szCs w:val="19"/>
-                <w:lang w:val="en-US"/>
               </w:rPr>
               <w:t>{address}</w:t>
             </w:r>
           </w:p>
         </w:tc>
       </w:tr>
-      <w:tr xmlns:wp14="http://schemas.microsoft.com/office/word/2010/wordml" wp14:textId="77777777">
+      <w:tr>
         <w:trPr>
           <w:trHeight w:val="446"/>
         </w:trPr>
@@ -523,9 +479,8 @@
           <w:tcPr>
             <w:tcW w:w="3759" w:type="dxa"/>
             <w:gridSpan w:val="2"/>
-            <w:tcMar/>
           </w:tcPr>
-          <w:p wp14:textId="77777777">
+          <w:p>
             <w:pPr>
               <w:pStyle w:val="TableText"/>
               <w:spacing w:before="154" w:line="196" w:lineRule="auto"/>
@@ -543,100 +498,60 @@
           <w:tcPr>
             <w:tcW w:w="6850" w:type="dxa"/>
             <w:gridSpan w:val="4"/>
-            <w:tcMar/>
             <w:vAlign w:val="center"/>
           </w:tcPr>
-          <w:p wp14:textId="09B01C2D">
+          <w:p>
             <w:pPr>
               <w:pStyle w:val="TableText"/>
-              <w:jc w:val="left"/>
-              <w:rPr>
-                <w:rFonts w:ascii="Consolas" w:hAnsi="Consolas" w:eastAsia="Consolas" w:cs="Consolas"/>
-                <w:b w:val="0"/>
-                <w:bCs w:val="0"/>
-                <w:i w:val="0"/>
-                <w:iCs w:val="0"/>
-                <w:caps w:val="0"/>
-                <w:smallCaps w:val="0"/>
-                <w:noProof w:val="0"/>
+              <w:rPr>
+                <w:rFonts w:ascii="Consolas" w:eastAsia="Consolas" w:hAnsi="Consolas" w:cs="Consolas"/>
                 <w:color w:val="auto"/>
                 <w:sz w:val="19"/>
                 <w:szCs w:val="19"/>
-                <w:lang w:val="en-US"/>
               </w:rPr>
             </w:pPr>
             <w:r>
               <w:rPr>
-                <w:rFonts w:ascii="Consolas" w:hAnsi="Consolas" w:eastAsia="Consolas" w:cs="Consolas"/>
-                <w:b w:val="0"/>
-                <w:bCs w:val="0"/>
-                <w:i w:val="0"/>
-                <w:iCs w:val="0"/>
-                <w:caps w:val="0"/>
-                <w:smallCaps w:val="0"/>
-                <w:noProof w:val="0"/>
+                <w:rFonts w:ascii="Consolas" w:eastAsia="Consolas" w:hAnsi="Consolas" w:cs="Consolas"/>
                 <w:color w:val="auto"/>
                 <w:sz w:val="19"/>
                 <w:szCs w:val="19"/>
-                <w:lang w:val="en-US"/>
-              </w:rPr>
-              <w:t xml:space="preserve"> </w:t>
-            </w:r>
-            <w:r>
-              <w:rPr>
-                <w:rFonts w:ascii="Consolas" w:hAnsi="Consolas" w:eastAsia="Consolas" w:cs="Consolas"/>
-                <w:b w:val="0"/>
-                <w:bCs w:val="0"/>
-                <w:i w:val="0"/>
-                <w:iCs w:val="0"/>
-                <w:caps w:val="0"/>
-                <w:smallCaps w:val="0"/>
-                <w:noProof w:val="0"/>
+              </w:rPr>
+              <w:t xml:space="preserve"> </w:t>
+            </w:r>
+            <w:r>
+              <w:rPr>
+                <w:rFonts w:ascii="Consolas" w:eastAsia="Consolas" w:hAnsi="Consolas" w:cs="Consolas"/>
                 <w:color w:val="auto"/>
                 <w:sz w:val="19"/>
                 <w:szCs w:val="19"/>
-                <w:lang w:val="en-US"/>
               </w:rPr>
               <w:t>{</w:t>
             </w:r>
-            <w:r>
-              <w:rPr>
-                <w:rFonts w:ascii="Consolas" w:hAnsi="Consolas" w:eastAsia="Consolas" w:cs="Consolas"/>
-                <w:b w:val="0"/>
-                <w:bCs w:val="0"/>
-                <w:i w:val="0"/>
-                <w:iCs w:val="0"/>
-                <w:caps w:val="0"/>
-                <w:smallCaps w:val="0"/>
-                <w:noProof w:val="0"/>
+            <w:proofErr w:type="spellStart"/>
+            <w:r>
+              <w:rPr>
+                <w:rFonts w:ascii="Consolas" w:eastAsia="Consolas" w:hAnsi="Consolas" w:cs="Consolas"/>
                 <w:color w:val="auto"/>
                 <w:sz w:val="19"/>
                 <w:szCs w:val="19"/>
-                <w:lang w:val="en-US"/>
               </w:rPr>
               <w:t>postcodeCity</w:t>
             </w:r>
-            <w:r>
-              <w:rPr>
-                <w:rFonts w:ascii="Consolas" w:hAnsi="Consolas" w:eastAsia="Consolas" w:cs="Consolas"/>
-                <w:b w:val="0"/>
-                <w:bCs w:val="0"/>
-                <w:i w:val="0"/>
-                <w:iCs w:val="0"/>
-                <w:caps w:val="0"/>
-                <w:smallCaps w:val="0"/>
-                <w:noProof w:val="0"/>
+            <w:proofErr w:type="spellEnd"/>
+            <w:r>
+              <w:rPr>
+                <w:rFonts w:ascii="Consolas" w:eastAsia="Consolas" w:hAnsi="Consolas" w:cs="Consolas"/>
                 <w:color w:val="auto"/>
                 <w:sz w:val="19"/>
                 <w:szCs w:val="19"/>
-                <w:lang w:val="en-US"/>
               </w:rPr>
               <w:t>}</w:t>
             </w:r>
           </w:p>
         </w:tc>
       </w:tr>
-      <w:tr xmlns:wp14="http://schemas.microsoft.com/office/word/2010/wordml" wp14:textId="77777777">
+      <w:tr>
         <w:trPr>
           <w:trHeight w:val="450"/>
         </w:trPr>
@@ -644,9 +559,8 @@
           <w:tcPr>
             <w:tcW w:w="3759" w:type="dxa"/>
             <w:gridSpan w:val="2"/>
-            <w:tcMar/>
           </w:tcPr>
-          <w:p wp14:textId="77777777">
+          <w:p>
             <w:pPr>
               <w:pStyle w:val="TableText"/>
               <w:spacing w:before="153" w:line="196" w:lineRule="auto"/>
@@ -664,66 +578,40 @@
           <w:tcPr>
             <w:tcW w:w="6850" w:type="dxa"/>
             <w:gridSpan w:val="4"/>
-            <w:tcMar/>
             <w:vAlign w:val="center"/>
           </w:tcPr>
-          <w:p wp14:textId="707732CD">
+          <w:p>
             <w:pPr>
               <w:pStyle w:val="TableText"/>
-              <w:jc w:val="left"/>
-              <w:rPr>
-                <w:rFonts w:ascii="Consolas" w:hAnsi="Consolas" w:eastAsia="Consolas" w:cs="Consolas"/>
-                <w:b w:val="0"/>
-                <w:bCs w:val="0"/>
-                <w:i w:val="0"/>
-                <w:iCs w:val="0"/>
-                <w:caps w:val="0"/>
-                <w:smallCaps w:val="0"/>
-                <w:noProof w:val="0"/>
+              <w:rPr>
+                <w:rFonts w:ascii="Consolas" w:eastAsia="Consolas" w:hAnsi="Consolas" w:cs="Consolas"/>
                 <w:color w:val="auto"/>
                 <w:sz w:val="19"/>
                 <w:szCs w:val="19"/>
-                <w:lang w:val="en-US"/>
               </w:rPr>
             </w:pPr>
             <w:r>
               <w:rPr>
-                <w:rFonts w:ascii="Consolas" w:hAnsi="Consolas" w:eastAsia="Consolas" w:cs="Consolas"/>
-                <w:b w:val="0"/>
-                <w:bCs w:val="0"/>
-                <w:i w:val="0"/>
-                <w:iCs w:val="0"/>
-                <w:caps w:val="0"/>
-                <w:smallCaps w:val="0"/>
-                <w:noProof w:val="0"/>
+                <w:rFonts w:ascii="Consolas" w:eastAsia="Consolas" w:hAnsi="Consolas" w:cs="Consolas"/>
                 <w:color w:val="auto"/>
                 <w:sz w:val="19"/>
                 <w:szCs w:val="19"/>
-                <w:lang w:val="en-US"/>
-              </w:rPr>
-              <w:t xml:space="preserve"> </w:t>
-            </w:r>
-            <w:r>
-              <w:rPr>
-                <w:rFonts w:ascii="Consolas" w:hAnsi="Consolas" w:eastAsia="Consolas" w:cs="Consolas"/>
-                <w:b w:val="0"/>
-                <w:bCs w:val="0"/>
-                <w:i w:val="0"/>
-                <w:iCs w:val="0"/>
-                <w:caps w:val="0"/>
-                <w:smallCaps w:val="0"/>
-                <w:noProof w:val="0"/>
+              </w:rPr>
+              <w:t xml:space="preserve"> </w:t>
+            </w:r>
+            <w:r>
+              <w:rPr>
+                <w:rFonts w:ascii="Consolas" w:eastAsia="Consolas" w:hAnsi="Consolas" w:cs="Consolas"/>
                 <w:color w:val="auto"/>
                 <w:sz w:val="19"/>
                 <w:szCs w:val="19"/>
-                <w:lang w:val="en-US"/>
               </w:rPr>
               <w:t>{country}</w:t>
             </w:r>
           </w:p>
         </w:tc>
       </w:tr>
-      <w:tr xmlns:wp14="http://schemas.microsoft.com/office/word/2010/wordml" wp14:textId="77777777">
+      <w:tr>
         <w:trPr>
           <w:trHeight w:val="445"/>
         </w:trPr>
@@ -731,9 +619,8 @@
           <w:tcPr>
             <w:tcW w:w="3759" w:type="dxa"/>
             <w:gridSpan w:val="2"/>
-            <w:tcMar/>
           </w:tcPr>
-          <w:p wp14:textId="77777777">
+          <w:p>
             <w:pPr>
               <w:pStyle w:val="TableText"/>
               <w:spacing w:before="153" w:line="196" w:lineRule="auto"/>
@@ -776,15 +663,13 @@
           <w:tcPr>
             <w:tcW w:w="6850" w:type="dxa"/>
             <w:gridSpan w:val="4"/>
-            <w:tcMar/>
             <w:vAlign w:val="center"/>
           </w:tcPr>
-          <w:p wp14:textId="1F352270">
+          <w:p>
             <w:pPr>
               <w:pStyle w:val="TableText"/>
-              <w:jc w:val="left"/>
-              <w:rPr>
-                <w:rFonts w:eastAsia="SimSun"/>
+              <w:rPr>
+                <w:rFonts w:eastAsia="宋体"/>
                 <w:sz w:val="21"/>
                 <w:szCs w:val="21"/>
                 <w:lang w:eastAsia="zh-CN"/>
@@ -792,7 +677,7 @@
             </w:pPr>
             <w:r>
               <w:rPr>
-                <w:rFonts w:eastAsia="SimSun"/>
+                <w:rFonts w:eastAsia="宋体"/>
                 <w:sz w:val="21"/>
                 <w:szCs w:val="21"/>
                 <w:lang w:eastAsia="zh-CN"/>
@@ -801,7 +686,7 @@
             </w:r>
             <w:r>
               <w:rPr>
-                <w:rFonts w:eastAsia="SimSun"/>
+                <w:rFonts w:eastAsia="宋体"/>
                 <w:sz w:val="21"/>
                 <w:szCs w:val="21"/>
                 <w:lang w:eastAsia="zh-CN"/>
@@ -810,7 +695,7 @@
             </w:r>
             <w:r>
               <w:rPr>
-                <w:rFonts w:eastAsia="SimSun"/>
+                <w:rFonts w:eastAsia="宋体"/>
                 <w:sz w:val="21"/>
                 <w:szCs w:val="21"/>
                 <w:lang w:eastAsia="zh-CN"/>
@@ -820,7 +705,7 @@
           </w:p>
         </w:tc>
       </w:tr>
-      <w:tr xmlns:wp14="http://schemas.microsoft.com/office/word/2010/wordml" wp14:textId="77777777">
+      <w:tr>
         <w:trPr>
           <w:trHeight w:val="445"/>
         </w:trPr>
@@ -828,9 +713,8 @@
           <w:tcPr>
             <w:tcW w:w="3759" w:type="dxa"/>
             <w:gridSpan w:val="2"/>
-            <w:tcMar/>
           </w:tcPr>
-          <w:p wp14:textId="77777777">
+          <w:p>
             <w:pPr>
               <w:pStyle w:val="TableText"/>
               <w:spacing w:before="153" w:line="196" w:lineRule="auto"/>
@@ -863,13 +747,11 @@
           <w:tcPr>
             <w:tcW w:w="6850" w:type="dxa"/>
             <w:gridSpan w:val="4"/>
-            <w:tcMar/>
             <w:vAlign w:val="center"/>
           </w:tcPr>
-          <w:p wp14:textId="77777777">
+          <w:p>
             <w:pPr>
               <w:pStyle w:val="TableText"/>
-              <w:jc w:val="left"/>
               <w:rPr>
                 <w:sz w:val="21"/>
                 <w:szCs w:val="21"/>
@@ -878,7 +760,7 @@
           </w:p>
         </w:tc>
       </w:tr>
-      <w:tr xmlns:wp14="http://schemas.microsoft.com/office/word/2010/wordml" wp14:textId="77777777">
+      <w:tr>
         <w:trPr>
           <w:trHeight w:val="656"/>
         </w:trPr>
@@ -886,9 +768,8 @@
           <w:tcPr>
             <w:tcW w:w="3759" w:type="dxa"/>
             <w:gridSpan w:val="2"/>
-            <w:tcMar/>
           </w:tcPr>
-          <w:p wp14:textId="77777777">
+          <w:p>
             <w:pPr>
               <w:pStyle w:val="TableText"/>
               <w:spacing w:before="149" w:line="233" w:lineRule="auto"/>
@@ -931,109 +812,68 @@
           <w:tcPr>
             <w:tcW w:w="6850" w:type="dxa"/>
             <w:gridSpan w:val="4"/>
-            <w:tcMar/>
             <w:vAlign w:val="center"/>
           </w:tcPr>
-          <w:p wp14:textId="143499B4">
+          <w:p>
             <w:pPr>
               <w:pStyle w:val="TableText"/>
-              <w:jc w:val="left"/>
-              <w:rPr>
-                <w:rFonts w:ascii="Consolas" w:hAnsi="Consolas" w:eastAsia="Consolas" w:cs="Consolas"/>
-                <w:b w:val="0"/>
-                <w:bCs w:val="0"/>
-                <w:i w:val="0"/>
-                <w:iCs w:val="0"/>
-                <w:caps w:val="0"/>
-                <w:smallCaps w:val="0"/>
-                <w:noProof w:val="0"/>
+              <w:rPr>
+                <w:rFonts w:ascii="Consolas" w:eastAsia="Consolas" w:hAnsi="Consolas" w:cs="Consolas"/>
                 <w:color w:val="auto"/>
                 <w:sz w:val="19"/>
                 <w:szCs w:val="19"/>
-                <w:lang w:val="en-US"/>
               </w:rPr>
             </w:pPr>
             <w:r>
               <w:rPr>
-                <w:rFonts w:ascii="Consolas" w:hAnsi="Consolas" w:eastAsia="Consolas" w:cs="Consolas"/>
-                <w:b w:val="0"/>
-                <w:bCs w:val="0"/>
-                <w:i w:val="0"/>
-                <w:iCs w:val="0"/>
-                <w:caps w:val="0"/>
-                <w:smallCaps w:val="0"/>
-                <w:noProof w:val="0"/>
+                <w:rFonts w:ascii="Consolas" w:eastAsia="Consolas" w:hAnsi="Consolas" w:cs="Consolas"/>
                 <w:color w:val="auto"/>
                 <w:sz w:val="19"/>
                 <w:szCs w:val="19"/>
-                <w:lang w:val="en-US"/>
-              </w:rPr>
-              <w:t xml:space="preserve"> </w:t>
-            </w:r>
-            <w:r>
-              <w:rPr>
-                <w:rFonts w:ascii="Consolas" w:hAnsi="Consolas" w:eastAsia="Consolas" w:cs="Consolas"/>
-                <w:b w:val="0"/>
-                <w:bCs w:val="0"/>
-                <w:i w:val="0"/>
-                <w:iCs w:val="0"/>
-                <w:caps w:val="0"/>
-                <w:smallCaps w:val="0"/>
-                <w:noProof w:val="0"/>
+              </w:rPr>
+              <w:t xml:space="preserve"> </w:t>
+            </w:r>
+            <w:r>
+              <w:rPr>
+                <w:rFonts w:ascii="Consolas" w:eastAsia="Consolas" w:hAnsi="Consolas" w:cs="Consolas"/>
                 <w:color w:val="auto"/>
                 <w:sz w:val="19"/>
                 <w:szCs w:val="19"/>
-                <w:lang w:val="en-US"/>
               </w:rPr>
               <w:t>{</w:t>
             </w:r>
-            <w:r>
-              <w:rPr>
-                <w:rFonts w:ascii="Consolas" w:hAnsi="Consolas" w:eastAsia="Consolas" w:cs="Consolas"/>
-                <w:b w:val="0"/>
-                <w:bCs w:val="0"/>
-                <w:i w:val="0"/>
-                <w:iCs w:val="0"/>
-                <w:caps w:val="0"/>
-                <w:smallCaps w:val="0"/>
-                <w:noProof w:val="0"/>
+            <w:proofErr w:type="spellStart"/>
+            <w:r>
+              <w:rPr>
+                <w:rFonts w:ascii="Consolas" w:eastAsia="Consolas" w:hAnsi="Consolas" w:cs="Consolas"/>
                 <w:color w:val="auto"/>
                 <w:sz w:val="19"/>
                 <w:szCs w:val="19"/>
-                <w:lang w:val="en-US"/>
               </w:rPr>
               <w:t>collectionPoint</w:t>
             </w:r>
-            <w:r>
-              <w:rPr>
-                <w:rFonts w:ascii="Consolas" w:hAnsi="Consolas" w:eastAsia="Consolas" w:cs="Consolas"/>
-                <w:b w:val="0"/>
-                <w:bCs w:val="0"/>
-                <w:i w:val="0"/>
-                <w:iCs w:val="0"/>
-                <w:caps w:val="0"/>
-                <w:smallCaps w:val="0"/>
-                <w:noProof w:val="0"/>
+            <w:proofErr w:type="spellEnd"/>
+            <w:r>
+              <w:rPr>
+                <w:rFonts w:ascii="Consolas" w:eastAsia="Consolas" w:hAnsi="Consolas" w:cs="Consolas"/>
                 <w:color w:val="auto"/>
                 <w:sz w:val="19"/>
                 <w:szCs w:val="19"/>
-                <w:lang w:val="en-US"/>
               </w:rPr>
               <w:t>}</w:t>
             </w:r>
           </w:p>
         </w:tc>
       </w:tr>
-      <w:tr xmlns:wp14="http://schemas.microsoft.com/office/word/2010/wordml" wp14:textId="77777777">
+      <w:tr>
         <w:trPr>
           <w:trHeight w:val="549"/>
         </w:trPr>
         <w:tc>
           <w:tcPr>
             <w:tcW w:w="684" w:type="dxa"/>
-            <w:tcMar/>
           </w:tcPr>
-          <w:p wp14:textId="77777777">
+          <w:p>
             <w:pPr>
               <w:pStyle w:val="TableText"/>
               <w:spacing w:line="261" w:lineRule="auto"/>
@@ -1042,19 +882,19 @@
               </w:rPr>
             </w:pPr>
           </w:p>
-          <w:p wp14:textId="77777777">
+          <w:p>
             <w:pPr>
               <w:spacing w:before="58" w:line="194" w:lineRule="auto"/>
               <w:ind w:left="189"/>
               <w:rPr>
-                <w:rFonts w:ascii="Trebuchet MS" w:hAnsi="Trebuchet MS" w:eastAsia="Trebuchet MS" w:cs="Trebuchet MS"/>
+                <w:rFonts w:ascii="Trebuchet MS" w:eastAsia="Trebuchet MS" w:hAnsi="Trebuchet MS" w:cs="Trebuchet MS"/>
                 <w:sz w:val="20"/>
                 <w:szCs w:val="20"/>
               </w:rPr>
             </w:pPr>
             <w:r>
               <w:rPr>
-                <w:rFonts w:ascii="Trebuchet MS" w:hAnsi="Trebuchet MS" w:eastAsia="Trebuchet MS" w:cs="Trebuchet MS"/>
+                <w:rFonts w:ascii="Trebuchet MS" w:eastAsia="Trebuchet MS" w:hAnsi="Trebuchet MS" w:cs="Trebuchet MS"/>
                 <w:b/>
                 <w:bCs/>
                 <w:sz w:val="20"/>
@@ -1064,7 +904,7 @@
             </w:r>
             <w:r>
               <w:rPr>
-                <w:rFonts w:ascii="Trebuchet MS" w:hAnsi="Trebuchet MS" w:eastAsia="Trebuchet MS" w:cs="Trebuchet MS"/>
+                <w:rFonts w:ascii="Trebuchet MS" w:eastAsia="Trebuchet MS" w:hAnsi="Trebuchet MS" w:cs="Trebuchet MS"/>
                 <w:b/>
                 <w:bCs/>
                 <w:spacing w:val="10"/>
@@ -1079,9 +919,8 @@
           <w:tcPr>
             <w:tcW w:w="9925" w:type="dxa"/>
             <w:gridSpan w:val="5"/>
-            <w:tcMar/>
           </w:tcPr>
-          <w:p wp14:textId="77777777">
+          <w:p>
             <w:pPr>
               <w:pStyle w:val="TableText"/>
               <w:spacing w:line="259" w:lineRule="auto"/>
@@ -1090,19 +929,19 @@
               </w:rPr>
             </w:pPr>
           </w:p>
-          <w:p wp14:textId="77777777">
+          <w:p>
             <w:pPr>
               <w:spacing w:before="58" w:line="197" w:lineRule="auto"/>
               <w:ind w:left="4302"/>
               <w:rPr>
-                <w:rFonts w:ascii="Trebuchet MS" w:hAnsi="Trebuchet MS" w:eastAsia="Trebuchet MS" w:cs="Trebuchet MS"/>
+                <w:rFonts w:ascii="Trebuchet MS" w:eastAsia="Trebuchet MS" w:hAnsi="Trebuchet MS" w:cs="Trebuchet MS"/>
                 <w:sz w:val="20"/>
                 <w:szCs w:val="20"/>
               </w:rPr>
             </w:pPr>
             <w:r>
               <w:rPr>
-                <w:rFonts w:ascii="Trebuchet MS" w:hAnsi="Trebuchet MS" w:eastAsia="Trebuchet MS" w:cs="Trebuchet MS"/>
+                <w:rFonts w:ascii="Trebuchet MS" w:eastAsia="Trebuchet MS" w:hAnsi="Trebuchet MS" w:cs="Trebuchet MS"/>
                 <w:b/>
                 <w:bCs/>
                 <w:spacing w:val="4"/>
@@ -1114,16 +953,15 @@
           </w:p>
         </w:tc>
       </w:tr>
-      <w:tr xmlns:wp14="http://schemas.microsoft.com/office/word/2010/wordml" wp14:textId="77777777">
+      <w:tr>
         <w:trPr>
           <w:trHeight w:val="861"/>
         </w:trPr>
         <w:tc>
           <w:tcPr>
             <w:tcW w:w="684" w:type="dxa"/>
-            <w:tcMar/>
           </w:tcPr>
-          <w:p wp14:textId="77777777">
+          <w:p>
             <w:pPr>
               <w:pStyle w:val="TableText"/>
               <w:spacing w:line="303" w:lineRule="auto"/>
@@ -1132,7 +970,7 @@
               </w:rPr>
             </w:pPr>
           </w:p>
-          <w:p wp14:textId="77777777">
+          <w:p>
             <w:pPr>
               <w:pStyle w:val="TableText"/>
               <w:spacing w:before="52"/>
@@ -1147,9 +985,8 @@
           <w:tcPr>
             <w:tcW w:w="9925" w:type="dxa"/>
             <w:gridSpan w:val="5"/>
-            <w:tcMar/>
           </w:tcPr>
-          <w:p wp14:textId="77777777">
+          <w:p>
             <w:pPr>
               <w:pStyle w:val="TableText"/>
               <w:spacing w:before="146" w:line="244" w:lineRule="auto"/>
@@ -1230,6 +1067,7 @@
               </w:rPr>
               <w:t xml:space="preserve"> </w:t>
             </w:r>
+            <w:proofErr w:type="gramStart"/>
             <w:r>
               <w:rPr>
                 <w:spacing w:val="-1"/>
@@ -1237,7 +1075,11 @@
               <w:t>ISCC)</w:t>
             </w:r>
             <w:r>
-              <w:t xml:space="preserve">  including contractual agreements with subcontractors and recipients</w:t>
+              <w:t xml:space="preserve">  including</w:t>
+            </w:r>
+            <w:proofErr w:type="gramEnd"/>
+            <w:r>
+              <w:t xml:space="preserve"> contractual agreements with subcontractors and recipients</w:t>
             </w:r>
             <w:r>
               <w:rPr>
@@ -1290,16 +1132,15 @@
           </w:p>
         </w:tc>
       </w:tr>
-      <w:tr xmlns:wp14="http://schemas.microsoft.com/office/word/2010/wordml" wp14:textId="77777777">
+      <w:tr>
         <w:trPr>
           <w:trHeight w:val="1722"/>
         </w:trPr>
         <w:tc>
           <w:tcPr>
             <w:tcW w:w="684" w:type="dxa"/>
-            <w:tcMar/>
           </w:tcPr>
-          <w:p wp14:textId="77777777">
+          <w:p>
             <w:pPr>
               <w:pStyle w:val="TableText"/>
               <w:spacing w:line="243" w:lineRule="auto"/>
@@ -1308,7 +1149,7 @@
               </w:rPr>
             </w:pPr>
           </w:p>
-          <w:p wp14:textId="77777777">
+          <w:p>
             <w:pPr>
               <w:pStyle w:val="TableText"/>
               <w:spacing w:line="243" w:lineRule="auto"/>
@@ -1317,7 +1158,7 @@
               </w:rPr>
             </w:pPr>
           </w:p>
-          <w:p wp14:textId="77777777">
+          <w:p>
             <w:pPr>
               <w:pStyle w:val="TableText"/>
               <w:spacing w:line="244" w:lineRule="auto"/>
@@ -1326,7 +1167,7 @@
               </w:rPr>
             </w:pPr>
           </w:p>
-          <w:p wp14:textId="77777777">
+          <w:p>
             <w:pPr>
               <w:pStyle w:val="TableText"/>
               <w:spacing w:before="51"/>
@@ -1341,9 +1182,8 @@
           <w:tcPr>
             <w:tcW w:w="9925" w:type="dxa"/>
             <w:gridSpan w:val="5"/>
-            <w:tcMar/>
           </w:tcPr>
-          <w:p wp14:textId="77777777">
+          <w:p>
             <w:pPr>
               <w:pStyle w:val="TableText"/>
               <w:spacing w:before="150" w:line="199" w:lineRule="auto"/>
@@ -1413,7 +1253,7 @@
               <w:t>“residue”.</w:t>
             </w:r>
           </w:p>
-          <w:p wp14:textId="77777777">
+          <w:p>
             <w:pPr>
               <w:pStyle w:val="TableText"/>
               <w:spacing w:before="154" w:line="226" w:lineRule="auto"/>
@@ -1424,7 +1264,7 @@
             </w:r>
             <w:r>
               <w:rPr>
-                <w:rFonts w:ascii="Trebuchet MS" w:hAnsi="Trebuchet MS" w:eastAsia="Trebuchet MS" w:cs="Trebuchet MS"/>
+                <w:rFonts w:ascii="Trebuchet MS" w:eastAsia="Trebuchet MS" w:hAnsi="Trebuchet MS" w:cs="Trebuchet MS"/>
                 <w:b/>
                 <w:bCs/>
               </w:rPr>
@@ -1432,7 +1272,7 @@
             </w:r>
             <w:r>
               <w:rPr>
-                <w:rFonts w:ascii="Trebuchet MS" w:hAnsi="Trebuchet MS" w:eastAsia="Trebuchet MS" w:cs="Trebuchet MS"/>
+                <w:rFonts w:ascii="Trebuchet MS" w:eastAsia="Trebuchet MS" w:hAnsi="Trebuchet MS" w:cs="Trebuchet MS"/>
               </w:rPr>
               <w:t xml:space="preserve"> </w:t>
             </w:r>
@@ -1713,7 +1553,7 @@
               <w:t>an</w:t>
             </w:r>
           </w:p>
-          <w:p wp14:textId="77777777">
+          <w:p>
             <w:pPr>
               <w:pStyle w:val="TableText"/>
               <w:spacing w:before="22" w:line="196" w:lineRule="auto"/>
@@ -1726,7 +1566,7 @@
               <w:t>additional processing step.</w:t>
             </w:r>
           </w:p>
-          <w:p wp14:textId="77777777">
+          <w:p>
             <w:pPr>
               <w:pStyle w:val="TableText"/>
               <w:spacing w:before="156" w:line="226" w:lineRule="auto"/>
@@ -1747,7 +1587,7 @@
             </w:r>
             <w:r>
               <w:rPr>
-                <w:rFonts w:ascii="Trebuchet MS" w:hAnsi="Trebuchet MS" w:eastAsia="Trebuchet MS" w:cs="Trebuchet MS"/>
+                <w:rFonts w:ascii="Trebuchet MS" w:eastAsia="Trebuchet MS" w:hAnsi="Trebuchet MS" w:cs="Trebuchet MS"/>
                 <w:b/>
                 <w:bCs/>
                 <w:spacing w:val="-1"/>
@@ -1756,7 +1596,7 @@
             </w:r>
             <w:r>
               <w:rPr>
-                <w:rFonts w:ascii="Trebuchet MS" w:hAnsi="Trebuchet MS" w:eastAsia="Trebuchet MS" w:cs="Trebuchet MS"/>
+                <w:rFonts w:ascii="Trebuchet MS" w:eastAsia="Trebuchet MS" w:hAnsi="Trebuchet MS" w:cs="Trebuchet MS"/>
                 <w:spacing w:val="-1"/>
               </w:rPr>
               <w:t xml:space="preserve"> </w:t>
@@ -1785,6 +1625,7 @@
               </w:rPr>
               <w:t xml:space="preserve"> </w:t>
             </w:r>
+            <w:proofErr w:type="gramStart"/>
             <w:r>
               <w:rPr>
                 <w:spacing w:val="-1"/>
@@ -1801,7 +1642,14 @@
               <w:rPr>
                 <w:spacing w:val="-1"/>
               </w:rPr>
-              <w:t>product(s) that</w:t>
+              <w:t>product</w:t>
+            </w:r>
+            <w:proofErr w:type="gramEnd"/>
+            <w:r>
+              <w:rPr>
+                <w:spacing w:val="-1"/>
+              </w:rPr>
+              <w:t>(s) that</w:t>
             </w:r>
             <w:r>
               <w:rPr>
@@ -2072,7 +1920,7 @@
           </w:p>
         </w:tc>
       </w:tr>
-      <w:tr xmlns:wp14="http://schemas.microsoft.com/office/word/2010/wordml" wp14:textId="77777777">
+      <w:tr>
         <w:trPr>
           <w:trHeight w:val="1070"/>
         </w:trPr>
@@ -2082,9 +1930,8 @@
             <w:tcBorders>
               <w:bottom w:val="nil"/>
             </w:tcBorders>
-            <w:tcMar/>
           </w:tcPr>
-          <w:p wp14:textId="77777777">
+          <w:p>
             <w:pPr>
               <w:pStyle w:val="TableText"/>
               <w:spacing w:line="351" w:lineRule="auto"/>
@@ -2093,7 +1940,7 @@
               </w:rPr>
             </w:pPr>
           </w:p>
-          <w:p wp14:textId="77777777">
+          <w:p>
             <w:pPr>
               <w:pStyle w:val="TableText"/>
               <w:spacing w:before="51" w:line="237" w:lineRule="auto"/>
@@ -2111,9 +1958,8 @@
             <w:tcBorders>
               <w:bottom w:val="nil"/>
             </w:tcBorders>
-            <w:tcMar/>
           </w:tcPr>
-          <w:p wp14:textId="77777777">
+          <w:p>
             <w:pPr>
               <w:pStyle w:val="TableText"/>
               <w:spacing w:line="242" w:lineRule="auto"/>
@@ -2122,7 +1968,7 @@
               </w:rPr>
             </w:pPr>
           </w:p>
-          <w:p wp14:textId="77777777">
+          <w:p>
             <w:pPr>
               <w:pStyle w:val="TableText"/>
               <w:spacing w:before="51" w:line="227" w:lineRule="auto"/>
@@ -2307,16 +2153,15 @@
           <w:tcPr>
             <w:tcW w:w="480" w:type="dxa"/>
             <w:tcBorders>
-              <w:right w:val="single" w:color="000000" w:themeColor="text1" w:sz="6" w:space="0"/>
+              <w:right w:val="single" w:sz="6" w:space="0" w:color="000000" w:themeColor="text1"/>
             </w:tcBorders>
-            <w:tcMar/>
           </w:tcPr>
-          <w:p wp14:textId="77777777">
+          <w:p>
             <w:pPr>
               <w:pStyle w:val="TableText"/>
               <w:spacing w:line="135" w:lineRule="exact"/>
               <w:rPr>
-                <w:rFonts w:eastAsia="SimSun"/>
+                <w:rFonts w:eastAsia="宋体"/>
                 <w:sz w:val="11"/>
                 <w:lang w:eastAsia="zh-CN"/>
               </w:rPr>
@@ -2327,18 +2172,18 @@
           <w:tcPr>
             <w:tcW w:w="781" w:type="dxa"/>
             <w:tcBorders>
-              <w:left w:val="single" w:color="000000" w:themeColor="text1" w:sz="6" w:space="0"/>
+              <w:left w:val="single" w:sz="6" w:space="0" w:color="000000" w:themeColor="text1"/>
               <w:bottom w:val="nil"/>
               <w:right w:val="nil"/>
             </w:tcBorders>
-            <w:tcMar/>
           </w:tcPr>
-          <w:p wp14:textId="77777777">
+          <w:p>
             <w:pPr>
               <w:pStyle w:val="TableText"/>
               <w:spacing w:before="29"/>
               <w:ind w:left="95"/>
             </w:pPr>
+            <w:proofErr w:type="gramStart"/>
             <w:r>
               <w:rPr>
                 <w:spacing w:val="-8"/>
@@ -2357,13 +2202,15 @@
               </w:rPr>
               <w:t>PET</w:t>
             </w:r>
+            <w:proofErr w:type="gramEnd"/>
           </w:p>
-          <w:p wp14:textId="77777777">
+          <w:p>
             <w:pPr>
               <w:pStyle w:val="TableText"/>
               <w:spacing w:before="33" w:line="237" w:lineRule="auto"/>
               <w:ind w:left="83"/>
             </w:pPr>
+            <w:proofErr w:type="gramStart"/>
             <w:r>
               <w:rPr>
                 <w:spacing w:val="-5"/>
@@ -2382,13 +2229,15 @@
               </w:rPr>
               <w:t>PVC</w:t>
             </w:r>
+            <w:proofErr w:type="gramEnd"/>
           </w:p>
-          <w:p wp14:textId="77777777">
+          <w:p>
             <w:pPr>
               <w:pStyle w:val="TableText"/>
               <w:spacing w:before="30" w:line="237" w:lineRule="auto"/>
               <w:ind w:left="83"/>
             </w:pPr>
+            <w:proofErr w:type="gramStart"/>
             <w:r>
               <w:rPr>
                 <w:spacing w:val="-5"/>
@@ -2407,8 +2256,9 @@
               </w:rPr>
               <w:t>PP</w:t>
             </w:r>
+            <w:proofErr w:type="gramEnd"/>
           </w:p>
-          <w:p wp14:textId="77777777">
+          <w:p>
             <w:pPr>
               <w:pStyle w:val="TableText"/>
               <w:spacing w:before="34" w:line="213" w:lineRule="auto"/>
@@ -2441,9 +2291,8 @@
               <w:left w:val="nil"/>
               <w:bottom w:val="nil"/>
             </w:tcBorders>
-            <w:tcMar/>
           </w:tcPr>
-          <w:p wp14:textId="77777777">
+          <w:p>
             <w:pPr>
               <w:pStyle w:val="TableText"/>
               <w:spacing w:before="15" w:line="194" w:lineRule="auto"/>
@@ -2457,6 +2306,7 @@
               </w:rPr>
               <w:t xml:space="preserve"> </w:t>
             </w:r>
+            <w:proofErr w:type="gramStart"/>
             <w:r>
               <w:rPr>
                 <w:spacing w:val="7"/>
@@ -2466,8 +2316,9 @@
             <w:r>
               <w:t>HDPE</w:t>
             </w:r>
+            <w:proofErr w:type="gramEnd"/>
           </w:p>
-          <w:p wp14:textId="77777777">
+          <w:p>
             <w:pPr>
               <w:pStyle w:val="TableText"/>
               <w:spacing w:line="228" w:lineRule="exact"/>
@@ -2480,6 +2331,7 @@
               </w:rPr>
               <w:t xml:space="preserve"> </w:t>
             </w:r>
+            <w:proofErr w:type="gramStart"/>
             <w:r>
               <w:rPr>
                 <w:spacing w:val="-3"/>
@@ -2501,8 +2353,9 @@
               </w:rPr>
               <w:t>LDPE</w:t>
             </w:r>
+            <w:proofErr w:type="gramEnd"/>
           </w:p>
-          <w:p wp14:textId="77777777">
+          <w:p>
             <w:pPr>
               <w:pStyle w:val="TableText"/>
               <w:spacing w:before="6" w:line="226" w:lineRule="exact"/>
@@ -2515,6 +2368,7 @@
               </w:rPr>
               <w:t xml:space="preserve"> </w:t>
             </w:r>
+            <w:proofErr w:type="gramStart"/>
             <w:r>
               <w:rPr>
                 <w:spacing w:val="-5"/>
@@ -2536,19 +2390,19 @@
               </w:rPr>
               <w:t>PS</w:t>
             </w:r>
+            <w:proofErr w:type="gramEnd"/>
           </w:p>
         </w:tc>
       </w:tr>
-      <w:tr xmlns:wp14="http://schemas.microsoft.com/office/word/2010/wordml" wp14:textId="77777777">
+      <w:tr>
         <w:trPr>
           <w:trHeight w:val="1276"/>
         </w:trPr>
         <w:tc>
           <w:tcPr>
             <w:tcW w:w="684" w:type="dxa"/>
-            <w:tcMar/>
           </w:tcPr>
-          <w:p wp14:textId="77777777">
+          <w:p>
             <w:pPr>
               <w:pStyle w:val="TableText"/>
               <w:spacing w:line="261" w:lineRule="auto"/>
@@ -2557,7 +2411,7 @@
               </w:rPr>
             </w:pPr>
           </w:p>
-          <w:p wp14:textId="77777777">
+          <w:p>
             <w:pPr>
               <w:pStyle w:val="TableText"/>
               <w:spacing w:line="261" w:lineRule="auto"/>
@@ -2566,7 +2420,7 @@
               </w:rPr>
             </w:pPr>
           </w:p>
-          <w:p wp14:textId="77777777">
+          <w:p>
             <w:pPr>
               <w:pStyle w:val="TableText"/>
               <w:spacing w:before="52"/>
@@ -2581,9 +2435,8 @@
           <w:tcPr>
             <w:tcW w:w="9925" w:type="dxa"/>
             <w:gridSpan w:val="5"/>
-            <w:tcMar/>
           </w:tcPr>
-          <w:p wp14:textId="77777777">
+          <w:p>
             <w:pPr>
               <w:pStyle w:val="TableText"/>
               <w:spacing w:before="162" w:line="227" w:lineRule="auto"/>
@@ -2897,7 +2750,7 @@
               <w:t>relevant</w:t>
             </w:r>
           </w:p>
-          <w:p wp14:textId="77777777">
+          <w:p>
             <w:pPr>
               <w:pStyle w:val="TableText"/>
               <w:spacing w:before="23" w:line="227" w:lineRule="auto"/>
@@ -3186,7 +3039,7 @@
               <w:t>new</w:t>
             </w:r>
           </w:p>
-          <w:p wp14:textId="77777777">
+          <w:p>
             <w:pPr>
               <w:pStyle w:val="TableText"/>
               <w:spacing w:before="22" w:line="196" w:lineRule="auto"/>
@@ -3225,16 +3078,15 @@
           </w:p>
         </w:tc>
       </w:tr>
-      <w:tr xmlns:wp14="http://schemas.microsoft.com/office/word/2010/wordml" wp14:textId="77777777">
+      <w:tr>
         <w:trPr>
           <w:trHeight w:val="651"/>
         </w:trPr>
         <w:tc>
           <w:tcPr>
             <w:tcW w:w="684" w:type="dxa"/>
-            <w:tcMar/>
           </w:tcPr>
-          <w:p wp14:textId="77777777">
+          <w:p>
             <w:pPr>
               <w:pStyle w:val="TableText"/>
               <w:spacing w:before="266" w:line="237" w:lineRule="auto"/>
@@ -3249,9 +3101,8 @@
           <w:tcPr>
             <w:tcW w:w="9925" w:type="dxa"/>
             <w:gridSpan w:val="5"/>
-            <w:tcMar/>
           </w:tcPr>
-          <w:p wp14:textId="77777777">
+          <w:p>
             <w:pPr>
               <w:pStyle w:val="TableText"/>
               <w:spacing w:before="161" w:line="227" w:lineRule="auto"/>
@@ -3300,7 +3151,14 @@
               <w:rPr>
                 <w:spacing w:val="-1"/>
               </w:rPr>
-              <w:t>(in</w:t>
+              <w:t>(</w:t>
+            </w:r>
+            <w:proofErr w:type="gramStart"/>
+            <w:r>
+              <w:rPr>
+                <w:spacing w:val="-1"/>
+              </w:rPr>
+              <w:t>in</w:t>
             </w:r>
             <w:r>
               <w:rPr>
@@ -3314,6 +3172,7 @@
               </w:rPr>
               <w:t>particular with</w:t>
             </w:r>
+            <w:proofErr w:type="gramEnd"/>
             <w:r>
               <w:rPr>
                 <w:spacing w:val="12"/>
@@ -3381,16 +3240,15 @@
           </w:p>
         </w:tc>
       </w:tr>
-      <w:tr xmlns:wp14="http://schemas.microsoft.com/office/word/2010/wordml" wp14:textId="77777777">
+      <w:tr>
         <w:trPr>
           <w:trHeight w:val="451"/>
         </w:trPr>
         <w:tc>
           <w:tcPr>
             <w:tcW w:w="684" w:type="dxa"/>
-            <w:tcMar/>
           </w:tcPr>
-          <w:p wp14:textId="77777777">
+          <w:p>
             <w:pPr>
               <w:pStyle w:val="TableText"/>
               <w:spacing w:before="166" w:line="237" w:lineRule="auto"/>
@@ -3405,9 +3263,8 @@
           <w:tcPr>
             <w:tcW w:w="9925" w:type="dxa"/>
             <w:gridSpan w:val="5"/>
-            <w:tcMar/>
           </w:tcPr>
-          <w:p wp14:textId="77777777">
+          <w:p>
             <w:pPr>
               <w:pStyle w:val="TableText"/>
               <w:spacing w:before="144" w:line="178" w:lineRule="auto"/>
@@ -3415,7 +3272,7 @@
             </w:pPr>
             <w:r>
               <w:rPr>
-                <w:rFonts w:ascii="Wingdings 2" w:hAnsi="Wingdings 2" w:eastAsia="Wingdings 2" w:cs="Wingdings 2"/>
+                <w:rFonts w:ascii="Wingdings 2" w:eastAsia="Wingdings 2" w:hAnsi="Wingdings 2" w:cs="Wingdings 2"/>
                 <w:spacing w:val="-1"/>
                 <w:position w:val="1"/>
               </w:rPr>
@@ -3423,22 +3280,30 @@
             </w:r>
             <w:r>
               <w:rPr>
-                <w:rFonts w:ascii="PingFang SC" w:hAnsi="PingFang SC" w:eastAsia="PingFang SC" w:cs="PingFang SC"/>
+                <w:rFonts w:ascii="PingFang SC" w:eastAsia="PingFang SC" w:hAnsi="PingFang SC" w:cs="PingFang SC"/>
                 <w:spacing w:val="38"/>
                 <w:w w:val="101"/>
                 <w:position w:val="1"/>
               </w:rPr>
               <w:t xml:space="preserve"> </w:t>
             </w:r>
-            <w:r>
-              <w:rPr>
-                <w:spacing w:val="-1"/>
-              </w:rPr>
-              <w:t xml:space="preserve">Post-consumer material       </w:t>
-            </w:r>
-            <w:r>
-              <w:rPr>
-                <w:rFonts w:ascii="PingFang SC" w:hAnsi="PingFang SC" w:eastAsia="PingFang SC" w:cs="PingFang SC"/>
+            <w:proofErr w:type="gramStart"/>
+            <w:r>
+              <w:rPr>
+                <w:spacing w:val="-1"/>
+              </w:rPr>
+              <w:t>Post-consumer</w:t>
+            </w:r>
+            <w:proofErr w:type="gramEnd"/>
+            <w:r>
+              <w:rPr>
+                <w:spacing w:val="-1"/>
+              </w:rPr>
+              <w:t xml:space="preserve"> material       </w:t>
+            </w:r>
+            <w:r>
+              <w:rPr>
+                <w:rFonts w:ascii="PingFang SC" w:eastAsia="PingFang SC" w:hAnsi="PingFang SC" w:cs="PingFang SC"/>
                 <w:spacing w:val="-1"/>
                 <w:position w:val="1"/>
               </w:rPr>
@@ -3446,7 +3311,7 @@
             </w:r>
             <w:r>
               <w:rPr>
-                <w:rFonts w:ascii="PingFang SC" w:hAnsi="PingFang SC" w:eastAsia="PingFang SC" w:cs="PingFang SC"/>
+                <w:rFonts w:ascii="PingFang SC" w:eastAsia="PingFang SC" w:hAnsi="PingFang SC" w:cs="PingFang SC"/>
                 <w:spacing w:val="26"/>
                 <w:position w:val="1"/>
               </w:rPr>
@@ -3466,7 +3331,7 @@
             </w:r>
             <w:r>
               <w:rPr>
-                <w:rFonts w:ascii="PingFang SC" w:hAnsi="PingFang SC" w:eastAsia="PingFang SC" w:cs="PingFang SC"/>
+                <w:rFonts w:ascii="PingFang SC" w:eastAsia="PingFang SC" w:hAnsi="PingFang SC" w:cs="PingFang SC"/>
                 <w:spacing w:val="-1"/>
                 <w:position w:val="1"/>
               </w:rPr>
@@ -3474,7 +3339,7 @@
             </w:r>
             <w:r>
               <w:rPr>
-                <w:rFonts w:ascii="PingFang SC" w:hAnsi="PingFang SC" w:eastAsia="PingFang SC" w:cs="PingFang SC"/>
+                <w:rFonts w:ascii="PingFang SC" w:eastAsia="PingFang SC" w:hAnsi="PingFang SC" w:cs="PingFang SC"/>
                 <w:spacing w:val="25"/>
                 <w:w w:val="101"/>
                 <w:position w:val="1"/>
@@ -3490,16 +3355,15 @@
           </w:p>
         </w:tc>
       </w:tr>
-      <w:tr xmlns:wp14="http://schemas.microsoft.com/office/word/2010/wordml" wp14:textId="77777777">
+      <w:tr>
         <w:trPr>
           <w:trHeight w:val="450"/>
         </w:trPr>
         <w:tc>
           <w:tcPr>
             <w:tcW w:w="684" w:type="dxa"/>
-            <w:tcMar/>
           </w:tcPr>
-          <w:p wp14:textId="77777777">
+          <w:p>
             <w:pPr>
               <w:pStyle w:val="TableText"/>
               <w:spacing w:before="164"/>
@@ -3514,9 +3378,8 @@
           <w:tcPr>
             <w:tcW w:w="9925" w:type="dxa"/>
             <w:gridSpan w:val="5"/>
-            <w:tcMar/>
           </w:tcPr>
-          <w:p wp14:textId="77777777">
+          <w:p>
             <w:pPr>
               <w:pStyle w:val="TableText"/>
               <w:spacing w:before="143" w:line="226" w:lineRule="exact"/>
@@ -3532,7 +3395,7 @@
                 <w:position w:val="-2"/>
               </w:rPr>
               <w:drawing>
-                <wp:inline xmlns:wp14="http://schemas.microsoft.com/office/word/2010/wordprocessingDrawing" distT="0" distB="0" distL="0" distR="0" wp14:anchorId="3512AD12" wp14:editId="7777777">
+                <wp:inline distT="0" distB="0" distL="0" distR="0" wp14:anchorId="3512AD12" wp14:editId="07777777">
                   <wp:extent cx="107950" cy="107950"/>
                   <wp:effectExtent l="0" t="0" r="0" b="0"/>
                   <wp:docPr id="6" name="IM 6"/>
@@ -3581,7 +3444,7 @@
             </w:r>
             <w:r>
               <w:rPr>
-                <w:rFonts w:ascii="Wingdings 2" w:hAnsi="Wingdings 2" w:eastAsia="Wingdings 2" w:cs="Wingdings 2"/>
+                <w:rFonts w:ascii="Wingdings 2" w:eastAsia="Wingdings 2" w:hAnsi="Wingdings 2" w:cs="Wingdings 2"/>
                 <w:position w:val="-2"/>
               </w:rPr>
               <w:t>R</w:t>
@@ -3606,7 +3469,7 @@
               </w:rPr>
               <w:t>Circular</w:t>
             </w:r>
-            <w:hyperlink w:history="1" w:anchor="bookmark1">
+            <w:hyperlink w:anchor="bookmark1" w:history="1">
               <w:r>
                 <w:rPr>
                   <w:spacing w:val="-1"/>
@@ -3621,9 +3484,9 @@
         </w:tc>
       </w:tr>
     </w:tbl>
-    <w:p xmlns:wp14="http://schemas.microsoft.com/office/word/2010/wordml" wp14:textId="77777777">
+    <w:p>
       <w:pPr>
-        <w:pStyle w:val="BodyText"/>
+        <w:pStyle w:val="a3"/>
         <w:spacing w:before="183" w:line="230" w:lineRule="auto"/>
         <w:ind w:left="103" w:right="384" w:firstLine="15"/>
         <w:rPr>
@@ -4147,9 +4010,9 @@
         <w:t>above-</w:t>
       </w:r>
     </w:p>
-    <w:p xmlns:wp14="http://schemas.microsoft.com/office/word/2010/wordml" wp14:textId="77777777">
+    <w:p>
       <w:pPr>
-        <w:pStyle w:val="BodyText"/>
+        <w:pStyle w:val="a3"/>
         <w:spacing w:before="25" w:line="196" w:lineRule="auto"/>
         <w:ind w:left="113"/>
         <w:rPr>
@@ -4280,9 +4143,9 @@
         <w:t>request.</w:t>
       </w:r>
     </w:p>
-    <w:p xmlns:wp14="http://schemas.microsoft.com/office/word/2010/wordml" wp14:textId="77777777">
+    <w:p>
       <w:pPr>
-        <w:pStyle w:val="BodyText"/>
+        <w:pStyle w:val="a3"/>
         <w:spacing w:before="25" w:line="196" w:lineRule="auto"/>
         <w:ind w:left="113"/>
         <w:rPr>
@@ -4292,15 +4155,15 @@
         </w:rPr>
       </w:pPr>
     </w:p>
-    <w:p xmlns:wp14="http://schemas.microsoft.com/office/word/2010/wordml" wp14:textId="3DCE0DD4">
+    <w:p>
       <w:pPr>
-        <w:pStyle w:val="BodyText"/>
+        <w:pStyle w:val="a3"/>
         <w:spacing w:before="156" w:line="197" w:lineRule="auto"/>
         <w:ind w:left="115"/>
         <w:rPr>
-          <w:rFonts w:ascii="Trebuchet MS" w:hAnsi="Trebuchet MS" w:eastAsia="Trebuchet MS" w:cs="Trebuchet MS"/>
-          <w:b w:val="1"/>
-          <w:bCs w:val="1"/>
+          <w:rFonts w:ascii="Trebuchet MS" w:eastAsia="Trebuchet MS" w:hAnsi="Trebuchet MS" w:cs="Trebuchet MS"/>
+          <w:b/>
+          <w:bCs/>
           <w:spacing w:val="1"/>
           <w:sz w:val="18"/>
           <w:szCs w:val="18"/>
@@ -4310,269 +4173,184 @@
       </w:pPr>
       <w:r>
         <w:rPr>
-          <w:rFonts w:ascii="Trebuchet MS" w:hAnsi="Trebuchet MS" w:eastAsia="Trebuchet MS" w:cs="Trebuchet MS"/>
-          <w:b w:val="1"/>
-          <w:bCs w:val="1"/>
-          <w:sz w:val="18"/>
-          <w:szCs w:val="18"/>
-        </w:rPr>
-        <w:t>Place, Date</w:t>
-      </w:r>
-      <w:r>
-        <w:rPr>
-          <w:rFonts w:ascii="Trebuchet MS" w:hAnsi="Trebuchet MS" w:eastAsia="Trebuchet MS" w:cs="Trebuchet MS"/>
-          <w:b w:val="1"/>
-          <w:bCs w:val="1"/>
-          <w:sz w:val="18"/>
-          <w:szCs w:val="18"/>
-        </w:rPr>
-        <w:t>:</w:t>
-      </w:r>
-      <w:r>
-        <w:rPr>
-          <w:rFonts w:ascii="Trebuchet MS" w:hAnsi="Trebuchet MS" w:eastAsia="Trebuchet MS" w:cs="Trebuchet MS"/>
-          <w:b w:val="1"/>
-          <w:bCs w:val="1"/>
-          <w:sz w:val="18"/>
-          <w:szCs w:val="18"/>
-        </w:rPr>
-        <w:t xml:space="preserve"> </w:t>
-      </w:r>
-      <w:r>
-        <w:rPr>
-          <w:rFonts w:ascii="Trebuchet MS" w:hAnsi="Trebuchet MS" w:eastAsia="Trebuchet MS" w:cs="Trebuchet MS"/>
-          <w:b w:val="1"/>
-          <w:bCs w:val="1"/>
+          <w:rFonts w:ascii="Trebuchet MS" w:eastAsia="Trebuchet MS" w:hAnsi="Trebuchet MS" w:cs="Trebuchet MS"/>
+          <w:b/>
+          <w:bCs/>
+          <w:sz w:val="18"/>
+          <w:szCs w:val="18"/>
+        </w:rPr>
+        <w:t>Place, Date:</w:t>
+      </w:r>
+      <w:proofErr w:type="gramStart"/>
+      <w:r>
+        <w:rPr>
+          <w:rFonts w:ascii="Trebuchet MS" w:eastAsia="Trebuchet MS" w:hAnsi="Trebuchet MS" w:cs="Trebuchet MS"/>
+          <w:b/>
+          <w:bCs/>
+          <w:sz w:val="18"/>
+          <w:szCs w:val="18"/>
+        </w:rPr>
+        <w:t xml:space="preserve"> </w:t>
+      </w:r>
+      <w:r>
+        <w:rPr>
+          <w:rFonts w:ascii="Trebuchet MS" w:eastAsia="Trebuchet MS" w:hAnsi="Trebuchet MS" w:cs="Trebuchet MS"/>
+          <w:b/>
+          <w:bCs/>
           <w:color w:val="auto"/>
           <w:sz w:val="18"/>
           <w:szCs w:val="18"/>
-          <w:u w:val="none"/>
-        </w:rPr>
-        <w:t xml:space="preserve"> </w:t>
-      </w:r>
-      <w:r>
-        <w:rPr>
-          <w:rFonts w:ascii="Trebuchet MS" w:hAnsi="Trebuchet MS" w:eastAsia="Trebuchet MS" w:cs="Trebuchet MS"/>
-          <w:b w:val="1"/>
-          <w:bCs w:val="1"/>
+        </w:rPr>
+        <w:t xml:space="preserve"> </w:t>
+      </w:r>
+      <w:r>
+        <w:rPr>
+          <w:rFonts w:ascii="Trebuchet MS" w:eastAsia="Trebuchet MS" w:hAnsi="Trebuchet MS" w:cs="Trebuchet MS"/>
+          <w:b/>
+          <w:bCs/>
           <w:color w:val="auto"/>
           <w:sz w:val="18"/>
           <w:szCs w:val="18"/>
-          <w:u w:val="none"/>
-        </w:rPr>
-        <w:t xml:space="preserve"> </w:t>
-      </w:r>
-      <w:r>
-        <w:rPr>
-          <w:rFonts w:ascii="Consolas" w:hAnsi="Consolas" w:eastAsia="Consolas" w:cs="Consolas"/>
-          <w:b w:val="1"/>
-          <w:bCs w:val="1"/>
-          <w:i w:val="0"/>
-          <w:iCs w:val="0"/>
-          <w:caps w:val="0"/>
-          <w:smallCaps w:val="0"/>
-          <w:noProof w:val="0"/>
+        </w:rPr>
+        <w:t xml:space="preserve"> </w:t>
+      </w:r>
+      <w:r>
+        <w:rPr>
+          <w:rFonts w:ascii="Consolas" w:eastAsia="Consolas" w:hAnsi="Consolas" w:cs="Consolas"/>
+          <w:b/>
+          <w:bCs/>
           <w:color w:val="auto"/>
           <w:sz w:val="19"/>
           <w:szCs w:val="19"/>
-          <w:u w:val="none"/>
-          <w:lang w:val="en-US"/>
         </w:rPr>
         <w:t>{</w:t>
       </w:r>
-      <w:r>
-        <w:rPr>
-          <w:rFonts w:ascii="Consolas" w:hAnsi="Consolas" w:eastAsia="Consolas" w:cs="Consolas"/>
-          <w:b w:val="1"/>
-          <w:bCs w:val="1"/>
-          <w:i w:val="0"/>
-          <w:iCs w:val="0"/>
-          <w:caps w:val="0"/>
-          <w:smallCaps w:val="0"/>
-          <w:noProof w:val="0"/>
+      <w:proofErr w:type="spellStart"/>
+      <w:r>
+        <w:rPr>
+          <w:rFonts w:ascii="Consolas" w:eastAsia="Consolas" w:hAnsi="Consolas" w:cs="Consolas"/>
+          <w:b/>
+          <w:bCs/>
           <w:color w:val="auto"/>
           <w:sz w:val="19"/>
           <w:szCs w:val="19"/>
-          <w:u w:val="none"/>
-          <w:lang w:val="en-US"/>
         </w:rPr>
         <w:t>placeDate</w:t>
       </w:r>
-      <w:r>
-        <w:rPr>
-          <w:rFonts w:ascii="Consolas" w:hAnsi="Consolas" w:eastAsia="Consolas" w:cs="Consolas"/>
-          <w:b w:val="1"/>
-          <w:bCs w:val="1"/>
-          <w:i w:val="0"/>
-          <w:iCs w:val="0"/>
-          <w:caps w:val="0"/>
-          <w:smallCaps w:val="0"/>
-          <w:noProof w:val="0"/>
+      <w:proofErr w:type="spellEnd"/>
+      <w:r>
+        <w:rPr>
+          <w:rFonts w:ascii="Consolas" w:eastAsia="Consolas" w:hAnsi="Consolas" w:cs="Consolas"/>
+          <w:b/>
+          <w:bCs/>
           <w:color w:val="auto"/>
           <w:sz w:val="19"/>
           <w:szCs w:val="19"/>
-          <w:u w:val="none"/>
-          <w:lang w:val="en-US"/>
         </w:rPr>
         <w:t>}</w:t>
       </w:r>
       <w:r>
         <w:rPr>
-          <w:rFonts w:ascii="Trebuchet MS" w:hAnsi="Trebuchet MS" w:eastAsia="Trebuchet MS" w:cs="Trebuchet MS"/>
-          <w:b w:val="1"/>
-          <w:bCs w:val="1"/>
+          <w:rFonts w:ascii="Trebuchet MS" w:eastAsia="Trebuchet MS" w:hAnsi="Trebuchet MS" w:cs="Trebuchet MS"/>
+          <w:b/>
+          <w:bCs/>
           <w:color w:val="auto"/>
           <w:sz w:val="18"/>
           <w:szCs w:val="18"/>
-          <w:u w:val="none"/>
-        </w:rPr>
-        <w:t xml:space="preserve"> </w:t>
-      </w:r>
-      <w:r>
-        <w:rPr>
-          <w:rFonts w:ascii="Trebuchet MS" w:hAnsi="Trebuchet MS" w:eastAsia="Trebuchet MS" w:cs="Trebuchet MS"/>
-          <w:b w:val="0"/>
-          <w:bCs w:val="0"/>
+        </w:rPr>
+        <w:t xml:space="preserve"> </w:t>
+      </w:r>
+      <w:r>
+        <w:rPr>
+          <w:rFonts w:ascii="Trebuchet MS" w:eastAsia="Trebuchet MS" w:hAnsi="Trebuchet MS" w:cs="Trebuchet MS"/>
           <w:color w:val="auto"/>
           <w:sz w:val="18"/>
           <w:szCs w:val="18"/>
-          <w:u w:val="none"/>
+        </w:rPr>
+        <w:t xml:space="preserve">  </w:t>
+      </w:r>
+      <w:proofErr w:type="gramEnd"/>
+      <w:r>
+        <w:rPr>
+          <w:rFonts w:ascii="Trebuchet MS" w:eastAsia="Trebuchet MS" w:hAnsi="Trebuchet MS" w:cs="Trebuchet MS"/>
+          <w:color w:val="auto"/>
+          <w:sz w:val="18"/>
+          <w:szCs w:val="18"/>
+        </w:rPr>
+        <w:t xml:space="preserve"> </w:t>
+      </w:r>
+      <w:r>
+        <w:rPr>
+          <w:rFonts w:ascii="Trebuchet MS" w:eastAsia="宋体" w:hAnsi="Trebuchet MS" w:cs="Trebuchet MS"/>
+          <w:color w:val="auto"/>
+          <w:sz w:val="18"/>
+          <w:szCs w:val="18"/>
+          <w:lang w:eastAsia="zh-CN"/>
+        </w:rPr>
+        <w:t xml:space="preserve">                               </w:t>
+      </w:r>
+      <w:r>
+        <w:rPr>
+          <w:rFonts w:ascii="Trebuchet MS" w:eastAsia="Trebuchet MS" w:hAnsi="Trebuchet MS" w:cs="Trebuchet MS"/>
+          <w:b/>
+          <w:bCs/>
+          <w:sz w:val="18"/>
+          <w:szCs w:val="18"/>
+        </w:rPr>
+        <w:t xml:space="preserve">                              Signature: </w:t>
+      </w:r>
+      <w:proofErr w:type="gramStart"/>
+      <w:r>
+        <w:rPr>
+          <w:rFonts w:ascii="Trebuchet MS" w:eastAsia="Trebuchet MS" w:hAnsi="Trebuchet MS" w:cs="Trebuchet MS"/>
+          <w:b/>
+          <w:bCs/>
+          <w:sz w:val="18"/>
+          <w:szCs w:val="18"/>
         </w:rPr>
         <w:t xml:space="preserve">   </w:t>
       </w:r>
       <w:r>
         <w:rPr>
-          <w:rFonts w:ascii="Trebuchet MS" w:hAnsi="Trebuchet MS" w:eastAsia="SimSun" w:cs="Trebuchet MS"/>
-          <w:b w:val="0"/>
-          <w:bCs w:val="0"/>
-          <w:color w:val="auto"/>
-          <w:sz w:val="18"/>
-          <w:szCs w:val="18"/>
-          <w:u w:val="none"/>
-          <w:lang w:eastAsia="zh-CN"/>
-        </w:rPr>
-        <w:t xml:space="preserve">                          </w:t>
-      </w:r>
-      <w:r>
-        <w:rPr>
-          <w:rFonts w:ascii="Trebuchet MS" w:hAnsi="Trebuchet MS" w:eastAsia="SimSun" w:cs="Trebuchet MS"/>
-          <w:b w:val="0"/>
-          <w:bCs w:val="0"/>
-          <w:color w:val="auto"/>
-          <w:sz w:val="18"/>
-          <w:szCs w:val="18"/>
-          <w:u w:val="none"/>
-          <w:lang w:eastAsia="zh-CN"/>
-        </w:rPr>
-        <w:t xml:space="preserve">    </w:t>
-      </w:r>
-      <w:r>
-        <w:rPr>
-          <w:rFonts w:ascii="Trebuchet MS" w:hAnsi="Trebuchet MS" w:eastAsia="SimSun" w:cs="Trebuchet MS"/>
-          <w:b w:val="0"/>
-          <w:bCs w:val="0"/>
-          <w:color w:val="auto"/>
-          <w:sz w:val="18"/>
-          <w:szCs w:val="18"/>
-          <w:u w:val="none"/>
-          <w:lang w:eastAsia="zh-CN"/>
-        </w:rPr>
-        <w:t xml:space="preserve"> </w:t>
-      </w:r>
-      <w:r>
-        <w:rPr>
-          <w:rFonts w:ascii="Trebuchet MS" w:hAnsi="Trebuchet MS" w:eastAsia="Trebuchet MS" w:cs="Trebuchet MS"/>
-          <w:b w:val="1"/>
-          <w:bCs w:val="1"/>
-          <w:sz w:val="18"/>
-          <w:szCs w:val="18"/>
-        </w:rPr>
-        <w:t xml:space="preserve">    </w:t>
-      </w:r>
-      <w:r>
-        <w:rPr>
-          <w:rFonts w:ascii="Trebuchet MS" w:hAnsi="Trebuchet MS" w:eastAsia="Trebuchet MS" w:cs="Trebuchet MS"/>
-          <w:b w:val="1"/>
-          <w:bCs w:val="1"/>
-          <w:sz w:val="18"/>
-          <w:szCs w:val="18"/>
-        </w:rPr>
-        <w:t xml:space="preserve">                          Signature: </w:t>
-      </w:r>
-      <w:r>
-        <w:rPr>
-          <w:rFonts w:ascii="Trebuchet MS" w:hAnsi="Trebuchet MS" w:eastAsia="Trebuchet MS" w:cs="Trebuchet MS"/>
-          <w:b w:val="1"/>
-          <w:bCs w:val="1"/>
-          <w:sz w:val="18"/>
-          <w:szCs w:val="18"/>
-          <w:u w:val="none"/>
-        </w:rPr>
-        <w:t xml:space="preserve">  </w:t>
-      </w:r>
-      <w:r>
-        <w:rPr>
-          <w:rFonts w:ascii="Trebuchet MS" w:hAnsi="Trebuchet MS" w:eastAsia="Trebuchet MS" w:cs="Trebuchet MS"/>
-          <w:b w:val="1"/>
-          <w:bCs w:val="1"/>
-          <w:sz w:val="18"/>
-          <w:szCs w:val="18"/>
-          <w:u w:val="none"/>
-        </w:rPr>
-        <w:t xml:space="preserve"> </w:t>
-      </w:r>
-      <w:r>
-        <w:rPr>
-          <w:rFonts w:ascii="Trebuchet MS" w:hAnsi="Trebuchet MS" w:eastAsia="Trebuchet MS" w:cs="Trebuchet MS"/>
-          <w:b w:val="1"/>
-          <w:bCs w:val="1"/>
-          <w:sz w:val="18"/>
-          <w:szCs w:val="18"/>
-          <w:u w:val="none"/>
+          <w:rFonts w:ascii="Trebuchet MS" w:eastAsia="Trebuchet MS" w:hAnsi="Trebuchet MS" w:cs="Trebuchet MS"/>
+          <w:b/>
+          <w:bCs/>
+          <w:sz w:val="18"/>
+          <w:szCs w:val="18"/>
         </w:rPr>
         <w:t>{</w:t>
       </w:r>
-      <w:r>
-        <w:rPr>
-          <w:rFonts w:ascii="Trebuchet MS" w:hAnsi="Trebuchet MS" w:eastAsia="Trebuchet MS" w:cs="Trebuchet MS"/>
-          <w:b w:val="1"/>
-          <w:bCs w:val="1"/>
-          <w:sz w:val="18"/>
-          <w:szCs w:val="18"/>
-          <w:u w:val="none"/>
+      <w:proofErr w:type="spellStart"/>
+      <w:proofErr w:type="gramEnd"/>
+      <w:r>
+        <w:rPr>
+          <w:rFonts w:ascii="Trebuchet MS" w:eastAsia="Trebuchet MS" w:hAnsi="Trebuchet MS" w:cs="Trebuchet MS"/>
+          <w:b/>
+          <w:bCs/>
+          <w:sz w:val="18"/>
+          <w:szCs w:val="18"/>
         </w:rPr>
         <w:t>legalPerson</w:t>
       </w:r>
-      <w:r>
-        <w:rPr>
-          <w:rFonts w:ascii="Trebuchet MS" w:hAnsi="Trebuchet MS" w:eastAsia="Trebuchet MS" w:cs="Trebuchet MS"/>
-          <w:b w:val="1"/>
-          <w:bCs w:val="1"/>
-          <w:sz w:val="18"/>
-          <w:szCs w:val="18"/>
-          <w:u w:val="none"/>
-        </w:rPr>
-        <w:t>}</w:t>
-      </w:r>
-      <w:r>
-        <w:rPr>
-          <w:rFonts w:ascii="Trebuchet MS" w:hAnsi="Trebuchet MS" w:eastAsia="Trebuchet MS" w:cs="Trebuchet MS"/>
-          <w:b w:val="1"/>
-          <w:bCs w:val="1"/>
-          <w:sz w:val="18"/>
-          <w:szCs w:val="18"/>
-          <w:u w:val="none"/>
-        </w:rPr>
-        <w:t xml:space="preserve">                      </w:t>
+      <w:proofErr w:type="spellEnd"/>
+      <w:r>
+        <w:rPr>
+          <w:rFonts w:ascii="Trebuchet MS" w:eastAsia="Trebuchet MS" w:hAnsi="Trebuchet MS" w:cs="Trebuchet MS"/>
+          <w:b/>
+          <w:bCs/>
+          <w:sz w:val="18"/>
+          <w:szCs w:val="18"/>
+        </w:rPr>
+        <w:t xml:space="preserve">}                      </w:t>
       </w:r>
     </w:p>
-    <w:p xmlns:wp14="http://schemas.microsoft.com/office/word/2010/wordml" wp14:textId="77777777">
+    <w:p>
       <w:pPr>
-        <w:pStyle w:val="BodyText"/>
+        <w:pStyle w:val="a3"/>
         <w:spacing w:before="156" w:line="197" w:lineRule="auto"/>
         <w:ind w:left="115"/>
         <w:rPr>
-          <w:rFonts w:ascii="Trebuchet MS" w:hAnsi="Trebuchet MS" w:eastAsia="SimSun" w:cs="Trebuchet MS"/>
+          <w:rFonts w:ascii="Trebuchet MS" w:eastAsia="宋体" w:hAnsi="Trebuchet MS" w:cs="Trebuchet MS"/>
           <w:spacing w:val="1"/>
           <w:sz w:val="18"/>
           <w:szCs w:val="18"/>
@@ -4588,15 +4366,15 @@
         <mc:AlternateContent>
           <mc:Choice Requires="wps">
             <w:drawing>
-              <wp:anchor xmlns:wp14="http://schemas.microsoft.com/office/word/2010/wordprocessingDrawing" distT="0" distB="0" distL="114300" distR="114300" simplePos="0" relativeHeight="251660288" behindDoc="0" locked="0" layoutInCell="1" allowOverlap="1" wp14:anchorId="7A867488" wp14:editId="7777777">
+              <wp:anchor distT="0" distB="0" distL="114300" distR="114300" simplePos="0" relativeHeight="251660288" behindDoc="0" locked="0" layoutInCell="1" allowOverlap="1" wp14:anchorId="7A867488" wp14:editId="7E8E39C0">
                 <wp:simplePos x="0" y="0"/>
                 <wp:positionH relativeFrom="column">
-                  <wp:posOffset>4398645</wp:posOffset>
+                  <wp:posOffset>4944745</wp:posOffset>
                 </wp:positionH>
                 <wp:positionV relativeFrom="paragraph">
-                  <wp:posOffset>45085</wp:posOffset>
+                  <wp:posOffset>48895</wp:posOffset>
                 </wp:positionV>
-                <wp:extent cx="2070100" cy="0"/>
+                <wp:extent cx="1397000" cy="0"/>
                 <wp:effectExtent l="0" t="12700" r="12700" b="12700"/>
                 <wp:wrapNone/>
                 <wp:docPr id="2" name="直接连接符 2"/>
@@ -4608,7 +4386,7 @@
                       <wps:spPr>
                         <a:xfrm>
                           <a:off x="0" y="0"/>
-                          <a:ext cx="2070100" cy="0"/>
+                          <a:ext cx="1397000" cy="0"/>
                         </a:xfrm>
                         <a:prstGeom prst="line">
                           <a:avLst/>
@@ -4637,12 +4415,15 @@
                     </wps:wsp>
                   </a:graphicData>
                 </a:graphic>
+                <wp14:sizeRelH relativeFrom="margin">
+                  <wp14:pctWidth>0</wp14:pctWidth>
+                </wp14:sizeRelH>
               </wp:anchor>
             </w:drawing>
           </mc:Choice>
           <mc:Fallback>
-            <w:pict w14:anchorId="05D10094">
-              <v:line id="直接连接符 2" style="position:absolute;z-index:251660288;visibility:visible;mso-wrap-style:square;mso-wrap-distance-left:9pt;mso-wrap-distance-top:0;mso-wrap-distance-right:9pt;mso-wrap-distance-bottom:0;mso-position-horizontal:absolute;mso-position-horizontal-relative:text;mso-position-vertical:absolute;mso-position-vertical-relative:text" o:spid="_x0000_s1026" strokecolor="black [3213]" strokeweight="2pt" from="346.35pt,3.55pt" to="509.35pt,3.55pt" w14:anchorId="49FE5182" o:gfxdata="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"/>
+            <w:pict>
+              <v:line w14:anchorId="2E9DB1E4" id="直接连接符 2" o:spid="_x0000_s1026" style="position:absolute;z-index:251660288;visibility:visible;mso-wrap-style:square;mso-width-percent:0;mso-wrap-distance-left:9pt;mso-wrap-distance-top:0;mso-wrap-distance-right:9pt;mso-wrap-distance-bottom:0;mso-position-horizontal:absolute;mso-position-horizontal-relative:text;mso-position-vertical:absolute;mso-position-vertical-relative:text;mso-width-percent:0;mso-width-relative:margin" from="389.35pt,3.85pt" to="499.35pt,3.85pt" o:gfxdata="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" strokecolor="black [3213]" strokeweight="2pt"/>
             </w:pict>
           </mc:Fallback>
         </mc:AlternateContent>
@@ -4655,10 +4436,10 @@
         <mc:AlternateContent>
           <mc:Choice Requires="wps">
             <w:drawing>
-              <wp:anchor xmlns:wp14="http://schemas.microsoft.com/office/word/2010/wordprocessingDrawing" distT="0" distB="0" distL="114300" distR="114300" simplePos="0" relativeHeight="251659264" behindDoc="0" locked="0" layoutInCell="1" allowOverlap="1" wp14:anchorId="4B2E5463" wp14:editId="7777777">
+              <wp:anchor distT="0" distB="0" distL="114300" distR="114300" simplePos="0" relativeHeight="251659264" behindDoc="0" locked="0" layoutInCell="1" allowOverlap="1" wp14:anchorId="4B2E5463" wp14:editId="5AACE7BE">
                 <wp:simplePos x="0" y="0"/>
                 <wp:positionH relativeFrom="column">
-                  <wp:posOffset>893445</wp:posOffset>
+                  <wp:posOffset>804545</wp:posOffset>
                 </wp:positionH>
                 <wp:positionV relativeFrom="paragraph">
                   <wp:posOffset>45085</wp:posOffset>
@@ -4674,7 +4455,7 @@
                       <wps:cNvCnPr/>
                       <wps:spPr>
                         <a:xfrm>
-                          <a:off x="1295400" y="8752205"/>
+                          <a:off x="0" y="0"/>
                           <a:ext cx="1816100" cy="0"/>
                         </a:xfrm>
                         <a:prstGeom prst="line">
@@ -4708,19 +4489,20 @@
             </w:drawing>
           </mc:Choice>
           <mc:Fallback>
-            <w:pict w14:anchorId="7EA572EA">
-              <v:line id="直接连接符 1" style="position:absolute;z-index:251659264;visibility:visible;mso-wrap-style:square;mso-wrap-distance-left:9pt;mso-wrap-distance-top:0;mso-wrap-distance-right:9pt;mso-wrap-distance-bottom:0;mso-position-horizontal:absolute;mso-position-horizontal-relative:text;mso-position-vertical:absolute;mso-position-vertical-relative:text" o:spid="_x0000_s1026" strokecolor="black [3213]" strokeweight="2pt" from="70.35pt,3.55pt" to="213.35pt,3.55pt" w14:anchorId="2FEC799F" o:gfxdata="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"/>
+            <w:pict>
+              <v:line w14:anchorId="24506890" id="直接连接符 1" o:spid="_x0000_s1026" style="position:absolute;z-index:251659264;visibility:visible;mso-wrap-style:square;mso-wrap-distance-left:9pt;mso-wrap-distance-top:0;mso-wrap-distance-right:9pt;mso-wrap-distance-bottom:0;mso-position-horizontal:absolute;mso-position-horizontal-relative:text;mso-position-vertical:absolute;mso-position-vertical-relative:text" from="63.35pt,3.55pt" to="206.35pt,3.55pt" o:gfxdata="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" strokecolor="black [3213]" strokeweight="2pt"/>
             </w:pict>
           </mc:Fallback>
         </mc:AlternateContent>
       </w:r>
     </w:p>
-    <w:p xmlns:wp14="http://schemas.microsoft.com/office/word/2010/wordml" wp14:textId="77777777">
+    <w:p>
       <w:pPr>
-        <w:pStyle w:val="BodyText"/>
+        <w:pStyle w:val="a3"/>
         <w:spacing w:before="47" w:line="258" w:lineRule="auto"/>
         <w:ind w:left="112" w:right="252"/>
       </w:pPr>
+      <w:proofErr w:type="gramStart"/>
       <w:r>
         <w:rPr>
           <w:spacing w:val="-1"/>
@@ -4734,7 +4516,14 @@
         <w:rPr>
           <w:spacing w:val="-1"/>
         </w:rPr>
-        <w:t>Example feedstocks: circular (including technical-circular): mixed</w:t>
+        <w:t>Example</w:t>
+      </w:r>
+      <w:proofErr w:type="gramEnd"/>
+      <w:r>
+        <w:rPr>
+          <w:spacing w:val="-1"/>
+        </w:rPr>
+        <w:t xml:space="preserve"> feedstocks: circular (including technical-circular): mixed</w:t>
       </w:r>
       <w:r>
         <w:rPr>
@@ -4819,7 +4608,14 @@
         <w:rPr>
           <w:spacing w:val="-1"/>
         </w:rPr>
-        <w:t>(UCO)</w:t>
+        <w:t>(UCO</w:t>
+      </w:r>
+      <w:proofErr w:type="gramStart"/>
+      <w:r>
+        <w:rPr>
+          <w:spacing w:val="-1"/>
+        </w:rPr>
+        <w:t>)</w:t>
       </w:r>
       <w:r>
         <w:rPr>
@@ -4833,6 +4629,7 @@
         </w:rPr>
         <w:t>.</w:t>
       </w:r>
+      <w:proofErr w:type="gramEnd"/>
       <w:r>
         <w:rPr>
           <w:spacing w:val="14"/>
@@ -4860,7 +4657,7 @@
       <w:r>
         <w:t xml:space="preserve"> </w:t>
       </w:r>
-      <w:bookmarkStart w:name="bookmark1" w:id="0"/>
+      <w:bookmarkStart w:id="0" w:name="bookmark1"/>
       <w:bookmarkEnd w:id="0"/>
       <w:r>
         <w:rPr>
@@ -4907,9 +4704,9 @@
         <w:t>list</w:t>
       </w:r>
     </w:p>
-    <w:p xmlns:wp14="http://schemas.microsoft.com/office/word/2010/wordml" wp14:textId="77777777">
+    <w:p>
       <w:pPr>
-        <w:pStyle w:val="BodyText"/>
+        <w:pStyle w:val="a3"/>
         <w:spacing w:before="107" w:line="231" w:lineRule="auto"/>
         <w:ind w:left="113" w:right="180" w:hanging="8"/>
         <w:jc w:val="both"/>
@@ -5361,7 +5158,7 @@
     <w:sectPr>
       <w:headerReference w:type="default" r:id="rId8"/>
       <w:footerReference w:type="default" r:id="rId9"/>
-      <w:pgSz w:w="11900" w:h="16840" w:orient="portrait"/>
+      <w:pgSz w:w="11900" w:h="16840"/>
       <w:pgMar w:top="565" w:right="550" w:bottom="856" w:left="633" w:header="0" w:footer="706" w:gutter="0"/>
       <w:cols w:space="720"/>
     </w:sectPr>
@@ -5372,14 +5169,14 @@
 <file path=word/endnotes.xml><?xml version="1.0" encoding="utf-8"?>
 <w:endnotes xmlns:wpc="http://schemas.microsoft.com/office/word/2010/wordprocessingCanvas" xmlns:cx="http://schemas.microsoft.com/office/drawing/2014/chartex" xmlns:cx1="http://schemas.microsoft.com/office/drawing/2015/9/8/chartex" xmlns:cx2="http://schemas.microsoft.com/office/drawing/2015/10/21/chartex" xmlns:cx3="http://schemas.microsoft.com/office/drawing/2016/5/9/chartex" xmlns:cx4="http://schemas.microsoft.com/office/drawing/2016/5/10/chartex" xmlns:cx5="http://schemas.microsoft.com/office/drawing/2016/5/11/chartex" xmlns:cx6="http://schemas.microsoft.com/office/drawing/2016/5/12/chartex" xmlns:cx7="http://schemas.microsoft.com/office/drawing/2016/5/13/chartex" xmlns:cx8="http://schemas.microsoft.com/office/drawing/2016/5/14/chartex" xmlns:mc="http://schemas.openxmlformats.org/markup-compatibility/2006" xmlns:aink="http://schemas.microsoft.com/office/drawing/2016/ink" xmlns:am3d="http://schemas.microsoft.com/office/drawing/2017/model3d" xmlns:o="urn:schemas-microsoft-com:office:office" xmlns:oel="http://schemas.microsoft.com/office/2019/extlst" xmlns:r="http://schemas.openxmlformats.org/officeDocument/2006/relationships" xmlns:m="http://schemas.openxmlformats.org/officeDocument/2006/math" xmlns:v="urn:schemas-microsoft-com:vml" xmlns:wp14="http://schemas.microsoft.com/office/word/2010/wordprocessingDrawing" xmlns:wp="http://schemas.openxmlformats.org/drawingml/2006/wordprocessingDrawing" xmlns:w10="urn:schemas-microsoft-com:office:word" xmlns:w="http://schemas.openxmlformats.org/wordprocessingml/2006/main" xmlns:w14="http://schemas.microsoft.com/office/word/2010/wordml" xmlns:w15="http://schemas.microsoft.com/office/word/2012/wordml" xmlns:w16cex="http://schemas.microsoft.com/office/word/2018/wordml/cex" xmlns:w16cid="http://schemas.microsoft.com/office/word/2016/wordml/cid" xmlns:w16="http://schemas.microsoft.com/office/word/2018/wordml" xmlns:w16du="http://schemas.microsoft.com/office/word/2023/wordml/word16du" xmlns:w16sdtdh="http://schemas.microsoft.com/office/word/2020/wordml/sdtdatahash" xmlns:w16sdtfl="http://schemas.microsoft.com/office/word/2024/wordml/sdtformatlock" xmlns:w16se="http://schemas.microsoft.com/office/word/2015/wordml/symex" xmlns:wpg="http://schemas.microsoft.com/office/word/2010/wordprocessingGroup" xmlns:wpi="http://schemas.microsoft.com/office/word/2010/wordprocessingInk" xmlns:wne="http://schemas.microsoft.com/office/word/2006/wordml" xmlns:wps="http://schemas.microsoft.com/office/word/2010/wordprocessingShape" mc:Ignorable="w14 w15 w16se w16cid w16 w16cex w16sdtdh w16sdtfl w16du wp14">
   <w:endnote w:type="separator" w:id="-1">
-    <w:p xmlns:wp14="http://schemas.microsoft.com/office/word/2010/wordml" wp14:textId="77777777">
+    <w:p>
       <w:r>
         <w:separator/>
       </w:r>
     </w:p>
   </w:endnote>
   <w:endnote w:type="continuationSeparator" w:id="0">
-    <w:p xmlns:wp14="http://schemas.microsoft.com/office/word/2010/wordml" wp14:textId="77777777">
+    <w:p>
       <w:r>
         <w:continuationSeparator/>
       </w:r>
@@ -5389,10 +5186,10 @@
 </file>
 
 <file path=word/footer1.xml><?xml version="1.0" encoding="utf-8"?>
-<w:ftr xmlns:wpc="http://schemas.microsoft.com/office/word/2010/wordprocessingCanvas" xmlns:cx="http://schemas.microsoft.com/office/drawing/2014/chartex" xmlns:cx1="http://schemas.microsoft.com/office/drawing/2015/9/8/chartex" xmlns:cx2="http://schemas.microsoft.com/office/drawing/2015/10/21/chartex" xmlns:cx3="http://schemas.microsoft.com/office/drawing/2016/5/9/chartex" xmlns:cx4="http://schemas.microsoft.com/office/drawing/2016/5/10/chartex" xmlns:cx5="http://schemas.microsoft.com/office/drawing/2016/5/11/chartex" xmlns:cx6="http://schemas.microsoft.com/office/drawing/2016/5/12/chartex" xmlns:cx7="http://schemas.microsoft.com/office/drawing/2016/5/13/chartex" xmlns:cx8="http://schemas.microsoft.com/office/drawing/2016/5/14/chartex" xmlns:mc="http://schemas.openxmlformats.org/markup-compatibility/2006" xmlns:aink="http://schemas.microsoft.com/office/drawing/2016/ink" xmlns:am3d="http://schemas.microsoft.com/office/drawing/2017/model3d" xmlns:o="urn:schemas-microsoft-com:office:office" xmlns:oel="http://schemas.microsoft.com/office/2019/extlst" xmlns:r="http://schemas.openxmlformats.org/officeDocument/2006/relationships" xmlns:m="http://schemas.openxmlformats.org/officeDocument/2006/math" xmlns:v="urn:schemas-microsoft-com:vml" xmlns:wp14="http://schemas.microsoft.com/office/word/2010/wordprocessingDrawing" xmlns:wp="http://schemas.openxmlformats.org/drawingml/2006/wordprocessingDrawing" xmlns:w10="urn:schemas-microsoft-com:office:word" xmlns:w="http://schemas.openxmlformats.org/wordprocessingml/2006/main" xmlns:w14="http://schemas.microsoft.com/office/word/2010/wordml" xmlns:w15="http://schemas.microsoft.com/office/word/2012/wordml" xmlns:w16cex="http://schemas.microsoft.com/office/word/2018/wordml/cex" xmlns:w16cid="http://schemas.microsoft.com/office/word/2016/wordml/cid" xmlns:w16="http://schemas.microsoft.com/office/word/2018/wordml" xmlns:w16du="http://schemas.microsoft.com/office/word/2023/wordml/word16du" xmlns:w16sdtdh="http://schemas.microsoft.com/office/word/2020/wordml/sdtdatahash" xmlns:w16sdtfl="http://schemas.microsoft.com/office/word/2024/wordml/sdtformatlock" xmlns:w16se="http://schemas.microsoft.com/office/word/2015/wordml/symex" xmlns:wpg="http://schemas.microsoft.com/office/word/2010/wordprocessingGroup" xmlns:wpi="http://schemas.microsoft.com/office/word/2010/wordprocessingInk" xmlns:wne="http://schemas.microsoft.com/office/word/2006/wordml" xmlns:wps="http://schemas.microsoft.com/office/word/2010/wordprocessingShape" xmlns:a="http://schemas.openxmlformats.org/drawingml/2006/main" xmlns:pic="http://schemas.openxmlformats.org/drawingml/2006/picture" mc:Ignorable="w14 w15 w16se w16cid w16 w16cex w16sdtdh w16sdtfl w16du wp14">
-  <w:p xmlns:wp14="http://schemas.microsoft.com/office/word/2010/wordml" wp14:textId="77777777">
+<w:ftr xmlns:wpc="http://schemas.microsoft.com/office/word/2010/wordprocessingCanvas" xmlns:cx="http://schemas.microsoft.com/office/drawing/2014/chartex" xmlns:cx1="http://schemas.microsoft.com/office/drawing/2015/9/8/chartex" xmlns:cx2="http://schemas.microsoft.com/office/drawing/2015/10/21/chartex" xmlns:cx3="http://schemas.microsoft.com/office/drawing/2016/5/9/chartex" xmlns:cx4="http://schemas.microsoft.com/office/drawing/2016/5/10/chartex" xmlns:cx5="http://schemas.microsoft.com/office/drawing/2016/5/11/chartex" xmlns:cx6="http://schemas.microsoft.com/office/drawing/2016/5/12/chartex" xmlns:cx7="http://schemas.microsoft.com/office/drawing/2016/5/13/chartex" xmlns:cx8="http://schemas.microsoft.com/office/drawing/2016/5/14/chartex" xmlns:mc="http://schemas.openxmlformats.org/markup-compatibility/2006" xmlns:aink="http://schemas.microsoft.com/office/drawing/2016/ink" xmlns:am3d="http://schemas.microsoft.com/office/drawing/2017/model3d" xmlns:o="urn:schemas-microsoft-com:office:office" xmlns:oel="http://schemas.microsoft.com/office/2019/extlst" xmlns:r="http://schemas.openxmlformats.org/officeDocument/2006/relationships" xmlns:m="http://schemas.openxmlformats.org/officeDocument/2006/math" xmlns:v="urn:schemas-microsoft-com:vml" xmlns:wp14="http://schemas.microsoft.com/office/word/2010/wordprocessingDrawing" xmlns:wp="http://schemas.openxmlformats.org/drawingml/2006/wordprocessingDrawing" xmlns:w10="urn:schemas-microsoft-com:office:word" xmlns:w="http://schemas.openxmlformats.org/wordprocessingml/2006/main" xmlns:w14="http://schemas.microsoft.com/office/word/2010/wordml" xmlns:w15="http://schemas.microsoft.com/office/word/2012/wordml" xmlns:w16cex="http://schemas.microsoft.com/office/word/2018/wordml/cex" xmlns:w16cid="http://schemas.microsoft.com/office/word/2016/wordml/cid" xmlns:w16="http://schemas.microsoft.com/office/word/2018/wordml" xmlns:w16du="http://schemas.microsoft.com/office/word/2023/wordml/word16du" xmlns:w16sdtdh="http://schemas.microsoft.com/office/word/2020/wordml/sdtdatahash" xmlns:w16sdtfl="http://schemas.microsoft.com/office/word/2024/wordml/sdtformatlock" xmlns:w16se="http://schemas.microsoft.com/office/word/2015/wordml/symex" xmlns:wpg="http://schemas.microsoft.com/office/word/2010/wordprocessingGroup" xmlns:wpi="http://schemas.microsoft.com/office/word/2010/wordprocessingInk" xmlns:wne="http://schemas.microsoft.com/office/word/2006/wordml" xmlns:wps="http://schemas.microsoft.com/office/word/2010/wordprocessingShape" mc:Ignorable="w14 w15 w16se w16cid w16 w16cex w16sdtdh w16sdtfl w16du wp14">
+  <w:p>
     <w:pPr>
-      <w:pStyle w:val="BodyText"/>
+      <w:pStyle w:val="a3"/>
       <w:spacing w:line="183" w:lineRule="auto"/>
     </w:pPr>
     <w:r>
@@ -5401,7 +5198,7 @@
         <w:position w:val="-15"/>
       </w:rPr>
       <w:drawing>
-        <wp:anchor xmlns:wp14="http://schemas.microsoft.com/office/word/2010/wordprocessingDrawing" distT="0" distB="0" distL="0" distR="0" simplePos="0" relativeHeight="251660288" behindDoc="1" locked="0" layoutInCell="1" allowOverlap="1" wp14:anchorId="06972539" wp14:editId="7777777">
+        <wp:anchor distT="0" distB="0" distL="0" distR="0" simplePos="0" relativeHeight="251660288" behindDoc="1" locked="0" layoutInCell="1" allowOverlap="1" wp14:anchorId="06972539" wp14:editId="07777777">
           <wp:simplePos x="0" y="0"/>
           <wp:positionH relativeFrom="column">
             <wp:posOffset>76200</wp:posOffset>
@@ -5443,18 +5240,18 @@
       </w:drawing>
     </w:r>
   </w:p>
-  <w:p xmlns:wp14="http://schemas.microsoft.com/office/word/2010/wordml" wp14:textId="77777777">
+  <w:p>
     <w:pPr>
-      <w:pStyle w:val="BodyText"/>
+      <w:pStyle w:val="a3"/>
       <w:spacing w:line="183" w:lineRule="auto"/>
       <w:rPr>
         <w:position w:val="-15"/>
       </w:rPr>
     </w:pPr>
   </w:p>
-  <w:p xmlns:wp14="http://schemas.microsoft.com/office/word/2010/wordml" wp14:textId="77777777">
+  <w:p>
     <w:pPr>
-      <w:pStyle w:val="BodyText"/>
+      <w:pStyle w:val="a3"/>
       <w:spacing w:line="183" w:lineRule="auto"/>
     </w:pPr>
     <w:r>
@@ -5516,14 +5313,14 @@
 <file path=word/footnotes.xml><?xml version="1.0" encoding="utf-8"?>
 <w:footnotes xmlns:wpc="http://schemas.microsoft.com/office/word/2010/wordprocessingCanvas" xmlns:cx="http://schemas.microsoft.com/office/drawing/2014/chartex" xmlns:cx1="http://schemas.microsoft.com/office/drawing/2015/9/8/chartex" xmlns:cx2="http://schemas.microsoft.com/office/drawing/2015/10/21/chartex" xmlns:cx3="http://schemas.microsoft.com/office/drawing/2016/5/9/chartex" xmlns:cx4="http://schemas.microsoft.com/office/drawing/2016/5/10/chartex" xmlns:cx5="http://schemas.microsoft.com/office/drawing/2016/5/11/chartex" xmlns:cx6="http://schemas.microsoft.com/office/drawing/2016/5/12/chartex" xmlns:cx7="http://schemas.microsoft.com/office/drawing/2016/5/13/chartex" xmlns:cx8="http://schemas.microsoft.com/office/drawing/2016/5/14/chartex" xmlns:mc="http://schemas.openxmlformats.org/markup-compatibility/2006" xmlns:aink="http://schemas.microsoft.com/office/drawing/2016/ink" xmlns:am3d="http://schemas.microsoft.com/office/drawing/2017/model3d" xmlns:o="urn:schemas-microsoft-com:office:office" xmlns:oel="http://schemas.microsoft.com/office/2019/extlst" xmlns:r="http://schemas.openxmlformats.org/officeDocument/2006/relationships" xmlns:m="http://schemas.openxmlformats.org/officeDocument/2006/math" xmlns:v="urn:schemas-microsoft-com:vml" xmlns:wp14="http://schemas.microsoft.com/office/word/2010/wordprocessingDrawing" xmlns:wp="http://schemas.openxmlformats.org/drawingml/2006/wordprocessingDrawing" xmlns:w10="urn:schemas-microsoft-com:office:word" xmlns:w="http://schemas.openxmlformats.org/wordprocessingml/2006/main" xmlns:w14="http://schemas.microsoft.com/office/word/2010/wordml" xmlns:w15="http://schemas.microsoft.com/office/word/2012/wordml" xmlns:w16cex="http://schemas.microsoft.com/office/word/2018/wordml/cex" xmlns:w16cid="http://schemas.microsoft.com/office/word/2016/wordml/cid" xmlns:w16="http://schemas.microsoft.com/office/word/2018/wordml" xmlns:w16du="http://schemas.microsoft.com/office/word/2023/wordml/word16du" xmlns:w16sdtdh="http://schemas.microsoft.com/office/word/2020/wordml/sdtdatahash" xmlns:w16sdtfl="http://schemas.microsoft.com/office/word/2024/wordml/sdtformatlock" xmlns:w16se="http://schemas.microsoft.com/office/word/2015/wordml/symex" xmlns:wpg="http://schemas.microsoft.com/office/word/2010/wordprocessingGroup" xmlns:wpi="http://schemas.microsoft.com/office/word/2010/wordprocessingInk" xmlns:wne="http://schemas.microsoft.com/office/word/2006/wordml" xmlns:wps="http://schemas.microsoft.com/office/word/2010/wordprocessingShape" mc:Ignorable="w14 w15 w16se w16cid w16 w16cex w16sdtdh w16sdtfl w16du wp14">
   <w:footnote w:type="separator" w:id="-1">
-    <w:p xmlns:wp14="http://schemas.microsoft.com/office/word/2010/wordml" wp14:textId="77777777">
+    <w:p>
       <w:r>
         <w:separator/>
       </w:r>
     </w:p>
   </w:footnote>
   <w:footnote w:type="continuationSeparator" w:id="0">
-    <w:p xmlns:wp14="http://schemas.microsoft.com/office/word/2010/wordml" wp14:textId="77777777">
+    <w:p>
       <w:r>
         <w:continuationSeparator/>
       </w:r>
@@ -5534,20 +5331,20 @@
 
 <file path=word/header1.xml><?xml version="1.0" encoding="utf-8"?>
 <w:hdr xmlns:wpc="http://schemas.microsoft.com/office/word/2010/wordprocessingCanvas" xmlns:cx="http://schemas.microsoft.com/office/drawing/2014/chartex" xmlns:cx1="http://schemas.microsoft.com/office/drawing/2015/9/8/chartex" xmlns:cx2="http://schemas.microsoft.com/office/drawing/2015/10/21/chartex" xmlns:cx3="http://schemas.microsoft.com/office/drawing/2016/5/9/chartex" xmlns:cx4="http://schemas.microsoft.com/office/drawing/2016/5/10/chartex" xmlns:cx5="http://schemas.microsoft.com/office/drawing/2016/5/11/chartex" xmlns:cx6="http://schemas.microsoft.com/office/drawing/2016/5/12/chartex" xmlns:cx7="http://schemas.microsoft.com/office/drawing/2016/5/13/chartex" xmlns:cx8="http://schemas.microsoft.com/office/drawing/2016/5/14/chartex" xmlns:mc="http://schemas.openxmlformats.org/markup-compatibility/2006" xmlns:aink="http://schemas.microsoft.com/office/drawing/2016/ink" xmlns:am3d="http://schemas.microsoft.com/office/drawing/2017/model3d" xmlns:o="urn:schemas-microsoft-com:office:office" xmlns:oel="http://schemas.microsoft.com/office/2019/extlst" xmlns:r="http://schemas.openxmlformats.org/officeDocument/2006/relationships" xmlns:m="http://schemas.openxmlformats.org/officeDocument/2006/math" xmlns:v="urn:schemas-microsoft-com:vml" xmlns:wp14="http://schemas.microsoft.com/office/word/2010/wordprocessingDrawing" xmlns:wp="http://schemas.openxmlformats.org/drawingml/2006/wordprocessingDrawing" xmlns:w10="urn:schemas-microsoft-com:office:word" xmlns:w="http://schemas.openxmlformats.org/wordprocessingml/2006/main" xmlns:w14="http://schemas.microsoft.com/office/word/2010/wordml" xmlns:w15="http://schemas.microsoft.com/office/word/2012/wordml" xmlns:w16cex="http://schemas.microsoft.com/office/word/2018/wordml/cex" xmlns:w16cid="http://schemas.microsoft.com/office/word/2016/wordml/cid" xmlns:w16="http://schemas.microsoft.com/office/word/2018/wordml" xmlns:w16du="http://schemas.microsoft.com/office/word/2023/wordml/word16du" xmlns:w16sdtdh="http://schemas.microsoft.com/office/word/2020/wordml/sdtdatahash" xmlns:w16sdtfl="http://schemas.microsoft.com/office/word/2024/wordml/sdtformatlock" xmlns:w16se="http://schemas.microsoft.com/office/word/2015/wordml/symex" xmlns:wpg="http://schemas.microsoft.com/office/word/2010/wordprocessingGroup" xmlns:wpi="http://schemas.microsoft.com/office/word/2010/wordprocessingInk" xmlns:wne="http://schemas.microsoft.com/office/word/2006/wordml" xmlns:wps="http://schemas.microsoft.com/office/word/2010/wordprocessingShape" mc:Ignorable="w14 w15 w16se w16cid w16 w16cex w16sdtdh w16sdtfl w16du wp14">
-  <w:p xmlns:wp14="http://schemas.microsoft.com/office/word/2010/wordml" wp14:textId="77777777">
+  <w:p>
     <w:pPr>
-      <w:pStyle w:val="Header"/>
+      <w:pStyle w:val="a4"/>
     </w:pPr>
   </w:p>
 </w:hdr>
 </file>
 
 <file path=word/styles.xml><?xml version="1.0" encoding="utf-8"?>
-<w:styles xmlns:wp14="http://schemas.microsoft.com/office/word/2010/wordprocessingDrawing" xmlns:mc="http://schemas.openxmlformats.org/markup-compatibility/2006" xmlns:r="http://schemas.openxmlformats.org/officeDocument/2006/relationships" xmlns:w="http://schemas.openxmlformats.org/wordprocessingml/2006/main" xmlns:w14="http://schemas.microsoft.com/office/word/2010/wordml" xmlns:w15="http://schemas.microsoft.com/office/word/2012/wordml" xmlns:w16cex="http://schemas.microsoft.com/office/word/2018/wordml/cex" xmlns:w16cid="http://schemas.microsoft.com/office/word/2016/wordml/cid" xmlns:w16="http://schemas.microsoft.com/office/word/2018/wordml" xmlns:w16du="http://schemas.microsoft.com/office/word/2023/wordml/word16du" xmlns:w16sdtdh="http://schemas.microsoft.com/office/word/2020/wordml/sdtdatahash" xmlns:w16sdtfl="http://schemas.microsoft.com/office/word/2024/wordml/sdtformatlock" xmlns:w16se="http://schemas.microsoft.com/office/word/2015/wordml/symex" mc:Ignorable="w14 w15 w16se w16cid w16 w16cex w16sdtdh w16sdtfl w16du wp14">
+<w:styles xmlns:mc="http://schemas.openxmlformats.org/markup-compatibility/2006" xmlns:r="http://schemas.openxmlformats.org/officeDocument/2006/relationships" xmlns:w="http://schemas.openxmlformats.org/wordprocessingml/2006/main" xmlns:w14="http://schemas.microsoft.com/office/word/2010/wordml" xmlns:w15="http://schemas.microsoft.com/office/word/2012/wordml" xmlns:w16cex="http://schemas.microsoft.com/office/word/2018/wordml/cex" xmlns:w16cid="http://schemas.microsoft.com/office/word/2016/wordml/cid" xmlns:w16="http://schemas.microsoft.com/office/word/2018/wordml" xmlns:w16du="http://schemas.microsoft.com/office/word/2023/wordml/word16du" xmlns:w16sdtdh="http://schemas.microsoft.com/office/word/2020/wordml/sdtdatahash" xmlns:w16sdtfl="http://schemas.microsoft.com/office/word/2024/wordml/sdtformatlock" xmlns:w16se="http://schemas.microsoft.com/office/word/2015/wordml/symex" mc:Ignorable="w14 w15 w16se w16cid w16 w16cex w16sdtdh w16sdtfl w16du">
   <w:docDefaults>
     <w:rPrDefault>
       <w:rPr>
-        <w:rFonts w:ascii="Arial" w:hAnsi="Arial" w:eastAsia="Arial" w:cs="Arial"/>
+        <w:rFonts w:ascii="Arial" w:eastAsiaTheme="minorEastAsia" w:hAnsi="Arial" w:cs="Arial"/>
         <w:lang w:val="en-US" w:eastAsia="ja-JP" w:bidi="ar-SA"/>
       </w:rPr>
     </w:rPrDefault>
@@ -5571,13 +5368,13 @@
     <w:lsdException w:name="Subtitle" w:qFormat="1"/>
     <w:lsdException w:name="Strong" w:qFormat="1"/>
     <w:lsdException w:name="Emphasis" w:qFormat="1"/>
-    <w:lsdException w:name="HTML Top of Form" w:uiPriority="99" w:semiHidden="1" w:unhideWhenUsed="1"/>
-    <w:lsdException w:name="HTML Bottom of Form" w:uiPriority="99" w:semiHidden="1" w:unhideWhenUsed="1"/>
+    <w:lsdException w:name="HTML Top of Form" w:semiHidden="1" w:uiPriority="99" w:unhideWhenUsed="1"/>
+    <w:lsdException w:name="HTML Bottom of Form" w:semiHidden="1" w:uiPriority="99" w:unhideWhenUsed="1"/>
     <w:lsdException w:name="Normal Table" w:semiHidden="1" w:unhideWhenUsed="1"/>
-    <w:lsdException w:name="No List" w:uiPriority="99" w:semiHidden="1" w:unhideWhenUsed="1"/>
-    <w:lsdException w:name="Outline List 1" w:uiPriority="99" w:semiHidden="1" w:unhideWhenUsed="1"/>
-    <w:lsdException w:name="Outline List 2" w:uiPriority="99" w:semiHidden="1" w:unhideWhenUsed="1"/>
-    <w:lsdException w:name="Outline List 3" w:uiPriority="99" w:semiHidden="1" w:unhideWhenUsed="1"/>
+    <w:lsdException w:name="No List" w:semiHidden="1" w:uiPriority="99" w:unhideWhenUsed="1"/>
+    <w:lsdException w:name="Outline List 1" w:semiHidden="1" w:uiPriority="99" w:unhideWhenUsed="1"/>
+    <w:lsdException w:name="Outline List 2" w:semiHidden="1" w:uiPriority="99" w:unhideWhenUsed="1"/>
+    <w:lsdException w:name="Outline List 3" w:semiHidden="1" w:uiPriority="99" w:unhideWhenUsed="1"/>
     <w:lsdException w:name="Table Simple 1" w:semiHidden="1" w:unhideWhenUsed="1"/>
     <w:lsdException w:name="Table Simple 2" w:semiHidden="1" w:unhideWhenUsed="1"/>
     <w:lsdException w:name="Table Simple 3" w:semiHidden="1" w:unhideWhenUsed="1"/>
@@ -5621,8 +5418,8 @@
     <w:lsdException w:name="Table Web 2" w:semiHidden="1" w:unhideWhenUsed="1"/>
     <w:lsdException w:name="Table Web 3" w:semiHidden="1" w:unhideWhenUsed="1"/>
     <w:lsdException w:name="Table Theme" w:semiHidden="1" w:unhideWhenUsed="1"/>
-    <w:lsdException w:name="Placeholder Text" w:uiPriority="99" w:semiHidden="1" w:unhideWhenUsed="1"/>
-    <w:lsdException w:name="No Spacing" w:uiPriority="99" w:semiHidden="1" w:unhideWhenUsed="1"/>
+    <w:lsdException w:name="Placeholder Text" w:semiHidden="1" w:uiPriority="99" w:unhideWhenUsed="1"/>
+    <w:lsdException w:name="No Spacing" w:semiHidden="1" w:uiPriority="99" w:unhideWhenUsed="1"/>
     <w:lsdException w:name="Light Shading" w:uiPriority="60"/>
     <w:lsdException w:name="Light List" w:uiPriority="61"/>
     <w:lsdException w:name="Light Grid" w:uiPriority="62"/>
@@ -5643,10 +5440,10 @@
     <w:lsdException w:name="Medium Shading 1 Accent 1" w:uiPriority="63"/>
     <w:lsdException w:name="Medium Shading 2 Accent 1" w:uiPriority="64"/>
     <w:lsdException w:name="Medium List 1 Accent 1" w:uiPriority="65"/>
-    <w:lsdException w:name="Revision" w:uiPriority="99" w:semiHidden="1" w:unhideWhenUsed="1"/>
-    <w:lsdException w:name="List Paragraph" w:uiPriority="99" w:semiHidden="1" w:unhideWhenUsed="1"/>
-    <w:lsdException w:name="Quote" w:uiPriority="99" w:semiHidden="1" w:unhideWhenUsed="1"/>
-    <w:lsdException w:name="Intense Quote" w:uiPriority="99" w:semiHidden="1" w:unhideWhenUsed="1"/>
+    <w:lsdException w:name="Revision" w:semiHidden="1" w:uiPriority="99" w:unhideWhenUsed="1"/>
+    <w:lsdException w:name="List Paragraph" w:semiHidden="1" w:uiPriority="99" w:unhideWhenUsed="1"/>
+    <w:lsdException w:name="Quote" w:semiHidden="1" w:uiPriority="99" w:unhideWhenUsed="1"/>
+    <w:lsdException w:name="Intense Quote" w:semiHidden="1" w:uiPriority="99" w:unhideWhenUsed="1"/>
     <w:lsdException w:name="Medium List 2 Accent 1" w:uiPriority="66"/>
     <w:lsdException w:name="Medium Grid 1 Accent 1" w:uiPriority="67"/>
     <w:lsdException w:name="Medium Grid 2 Accent 1" w:uiPriority="68"/>
@@ -5730,8 +5527,8 @@
     <w:lsdException w:name="Subtle Reference" w:uiPriority="31" w:qFormat="1"/>
     <w:lsdException w:name="Intense Reference" w:uiPriority="32" w:qFormat="1"/>
     <w:lsdException w:name="Book Title" w:uiPriority="33" w:qFormat="1"/>
-    <w:lsdException w:name="Bibliography" w:uiPriority="37" w:semiHidden="1" w:unhideWhenUsed="1"/>
-    <w:lsdException w:name="TOC Heading" w:uiPriority="39" w:semiHidden="1" w:unhideWhenUsed="1" w:qFormat="1"/>
+    <w:lsdException w:name="Bibliography" w:semiHidden="1" w:uiPriority="37" w:unhideWhenUsed="1"/>
+    <w:lsdException w:name="TOC Heading" w:semiHidden="1" w:uiPriority="39" w:unhideWhenUsed="1" w:qFormat="1"/>
     <w:lsdException w:name="Plain Table 1" w:uiPriority="41"/>
     <w:lsdException w:name="Plain Table 2" w:uiPriority="42"/>
     <w:lsdException w:name="Plain Table 3" w:uiPriority="43"/>
@@ -5836,13 +5633,13 @@
     <w:lsdException w:name="List Table 5 Dark Accent 6" w:uiPriority="50"/>
     <w:lsdException w:name="List Table 6 Colorful Accent 6" w:uiPriority="51"/>
     <w:lsdException w:name="List Table 7 Colorful Accent 6" w:uiPriority="52"/>
-    <w:lsdException w:name="Mention" w:uiPriority="99" w:semiHidden="1" w:unhideWhenUsed="1"/>
-    <w:lsdException w:name="Smart Hyperlink" w:uiPriority="99" w:semiHidden="1" w:unhideWhenUsed="1"/>
-    <w:lsdException w:name="Hashtag" w:uiPriority="99" w:semiHidden="1" w:unhideWhenUsed="1"/>
-    <w:lsdException w:name="Unresolved Mention" w:uiPriority="99" w:semiHidden="1" w:unhideWhenUsed="1"/>
-    <w:lsdException w:name="Smart Link" w:uiPriority="99" w:semiHidden="1" w:unhideWhenUsed="1"/>
+    <w:lsdException w:name="Mention" w:semiHidden="1" w:uiPriority="99" w:unhideWhenUsed="1"/>
+    <w:lsdException w:name="Smart Hyperlink" w:semiHidden="1" w:uiPriority="99" w:unhideWhenUsed="1"/>
+    <w:lsdException w:name="Hashtag" w:semiHidden="1" w:uiPriority="99" w:unhideWhenUsed="1"/>
+    <w:lsdException w:name="Unresolved Mention" w:semiHidden="1" w:uiPriority="99" w:unhideWhenUsed="1"/>
+    <w:lsdException w:name="Smart Link" w:semiHidden="1" w:uiPriority="99" w:unhideWhenUsed="1"/>
   </w:latentStyles>
-  <w:style w:type="paragraph" w:styleId="Normal" w:default="1">
+  <w:style w:type="paragraph" w:default="1" w:styleId="a">
     <w:name w:val="Normal"/>
     <w:semiHidden/>
     <w:qFormat/>
@@ -5862,13 +5659,13 @@
       <w:lang w:eastAsia="en-US"/>
     </w:rPr>
   </w:style>
-  <w:style w:type="character" w:styleId="DefaultParagraphFont" w:default="1">
+  <w:style w:type="character" w:default="1" w:styleId="a0">
     <w:name w:val="Default Paragraph Font"/>
     <w:uiPriority w:val="1"/>
     <w:semiHidden/>
     <w:unhideWhenUsed/>
   </w:style>
-  <w:style w:type="table" w:styleId="TableNormal" w:default="1">
+  <w:style w:type="table" w:default="1" w:styleId="a1">
     <w:name w:val="Normal Table"/>
     <w:uiPriority w:val="99"/>
     <w:semiHidden/>
@@ -5883,15 +5680,15 @@
       </w:tblCellMar>
     </w:tblPr>
   </w:style>
-  <w:style w:type="numbering" w:styleId="NoList" w:default="1">
+  <w:style w:type="numbering" w:default="1" w:styleId="a2">
     <w:name w:val="No List"/>
     <w:uiPriority w:val="99"/>
     <w:semiHidden/>
     <w:unhideWhenUsed/>
   </w:style>
-  <w:style w:type="paragraph" w:styleId="BodyText">
+  <w:style w:type="paragraph" w:styleId="a3">
     <w:name w:val="Body Text"/>
-    <w:basedOn w:val="Normal"/>
+    <w:basedOn w:val="a"/>
     <w:semiHidden/>
     <w:qFormat/>
     <w:rPr>
@@ -5899,15 +5696,15 @@
       <w:szCs w:val="16"/>
     </w:rPr>
   </w:style>
-  <w:style w:type="paragraph" w:styleId="Header">
+  <w:style w:type="paragraph" w:styleId="a4">
     <w:name w:val="header"/>
-    <w:basedOn w:val="Normal"/>
+    <w:basedOn w:val="a"/>
     <w:pPr>
       <w:pBdr>
-        <w:top w:val="none" w:color="auto" w:sz="0" w:space="1"/>
-        <w:left w:val="none" w:color="auto" w:sz="0" w:space="4"/>
-        <w:bottom w:val="none" w:color="auto" w:sz="0" w:space="1"/>
-        <w:right w:val="none" w:color="auto" w:sz="0" w:space="4"/>
+        <w:top w:val="none" w:sz="0" w:space="1" w:color="auto"/>
+        <w:left w:val="none" w:sz="0" w:space="4" w:color="auto"/>
+        <w:bottom w:val="none" w:sz="0" w:space="1" w:color="auto"/>
+        <w:right w:val="none" w:sz="0" w:space="4" w:color="auto"/>
       </w:pBdr>
       <w:tabs>
         <w:tab w:val="center" w:pos="4153"/>
@@ -5919,7 +5716,7 @@
       <w:sz w:val="18"/>
     </w:rPr>
   </w:style>
-  <w:style w:type="table" w:styleId="TableNormal1" w:customStyle="1">
+  <w:style w:type="table" w:customStyle="1" w:styleId="TableNormal1">
     <w:name w:val="Table Normal1"/>
     <w:semiHidden/>
     <w:unhideWhenUsed/>
@@ -5933,9 +5730,9 @@
       </w:tblCellMar>
     </w:tblPr>
   </w:style>
-  <w:style w:type="paragraph" w:styleId="TableText" w:customStyle="1">
+  <w:style w:type="paragraph" w:customStyle="1" w:styleId="TableText">
     <w:name w:val="Table Text"/>
-    <w:basedOn w:val="Normal"/>
+    <w:basedOn w:val="a"/>
     <w:semiHidden/>
     <w:qFormat/>
     <w:rPr>

</xml_diff>

<commit_message>
feat: integrate Husky for pre-commit checks and enhance DOCX merging functionality
- Added Husky for managing pre-commit hooks to ensure package.json and package-lock.json synchronization.
- Implemented functions to extract body content and section properties from DOCX files for more reliable merging.
- Enhanced the mergeDocxFiles function to handle multiple documents and maintain formatting.
- Updated package.json and package-lock.json to include Husky as a dependency.
</commit_message>
<xml_diff>
--- a/template/ISCC.docx
+++ b/template/ISCC.docx
@@ -867,25 +867,18 @@
       </w:tr>
       <w:tr>
         <w:trPr>
-          <w:trHeight w:val="549"/>
+          <w:trHeight w:val="397"/>
         </w:trPr>
         <w:tc>
           <w:tcPr>
             <w:tcW w:w="684" w:type="dxa"/>
+            <w:vAlign w:val="center"/>
           </w:tcPr>
-          <w:p>
-            <w:pPr>
-              <w:pStyle w:val="TableText"/>
-              <w:spacing w:line="261" w:lineRule="auto"/>
-              <w:rPr>
-                <w:sz w:val="21"/>
-              </w:rPr>
-            </w:pPr>
-          </w:p>
           <w:p>
             <w:pPr>
               <w:spacing w:before="58" w:line="194" w:lineRule="auto"/>
               <w:ind w:left="189"/>
+              <w:jc w:val="center"/>
               <w:rPr>
                 <w:rFonts w:ascii="Trebuchet MS" w:eastAsia="Trebuchet MS" w:hAnsi="Trebuchet MS" w:cs="Trebuchet MS"/>
                 <w:sz w:val="20"/>
@@ -919,16 +912,8 @@
           <w:tcPr>
             <w:tcW w:w="9925" w:type="dxa"/>
             <w:gridSpan w:val="5"/>
+            <w:vAlign w:val="center"/>
           </w:tcPr>
-          <w:p>
-            <w:pPr>
-              <w:pStyle w:val="TableText"/>
-              <w:spacing w:line="259" w:lineRule="auto"/>
-              <w:rPr>
-                <w:sz w:val="21"/>
-              </w:rPr>
-            </w:pPr>
-          </w:p>
           <w:p>
             <w:pPr>
               <w:spacing w:before="58" w:line="197" w:lineRule="auto"/>
@@ -4710,6 +4695,9 @@
         <w:spacing w:before="107" w:line="231" w:lineRule="auto"/>
         <w:ind w:left="113" w:right="180" w:hanging="8"/>
         <w:jc w:val="both"/>
+        <w:rPr>
+          <w:lang w:eastAsia="zh-CN"/>
+        </w:rPr>
       </w:pPr>
       <w:r>
         <w:t>This document neither replaces official delivery documents nor does it take pr</w:t>

</xml_diff>

<commit_message>
chore: update docker-compose and ISCC export functionality
- Renamed the container in docker-compose.yml from 'tyre-flow-app' to 'tyre-flow-external-db-app' for clarity.
- Simplified address construction in the ISCC export API by directly using the store address.
- Added Tencent LBS environment variables to docker-compose for enhanced location services.
- Removed an unused temporary DOCX template file.
</commit_message>
<xml_diff>
--- a/template/ISCC.docx
+++ b/template/ISCC.docx
@@ -3023,13 +3023,12 @@
               </w:rPr>
               <w:t>new</w:t>
             </w:r>
-          </w:p>
-          <w:p>
-            <w:pPr>
-              <w:pStyle w:val="TableText"/>
-              <w:spacing w:before="22" w:line="196" w:lineRule="auto"/>
-              <w:ind w:left="112"/>
-            </w:pPr>
+            <w:r>
+              <w:rPr>
+                <w:spacing w:val="-2"/>
+              </w:rPr>
+              <w:t xml:space="preserve"> </w:t>
+            </w:r>
             <w:r>
               <w:rPr>
                 <w:spacing w:val="-1"/>
@@ -3265,10 +3264,10 @@
             </w:r>
             <w:r>
               <w:rPr>
-                <w:rFonts w:ascii="PingFang SC" w:eastAsia="PingFang SC" w:hAnsi="PingFang SC" w:cs="PingFang SC"/>
-                <w:spacing w:val="38"/>
-                <w:w w:val="101"/>
+                <w:rFonts w:eastAsia="PingFang SC"/>
+                <w:spacing w:val="-1"/>
                 <w:position w:val="1"/>
+                <w:lang w:eastAsia="zh-CN"/>
               </w:rPr>
               <w:t xml:space="preserve"> </w:t>
             </w:r>
@@ -3288,17 +3287,18 @@
             </w:r>
             <w:r>
               <w:rPr>
-                <w:rFonts w:ascii="PingFang SC" w:eastAsia="PingFang SC" w:hAnsi="PingFang SC" w:cs="PingFang SC"/>
+                <w:rFonts w:ascii="Wingdings 2" w:eastAsia="PingFang SC" w:hAnsi="Wingdings 2" w:cs="PingFang SC"/>
                 <w:spacing w:val="-1"/>
                 <w:position w:val="1"/>
               </w:rPr>
-              <w:t>口</w:t>
-            </w:r>
-            <w:r>
-              <w:rPr>
-                <w:rFonts w:ascii="PingFang SC" w:eastAsia="PingFang SC" w:hAnsi="PingFang SC" w:cs="PingFang SC"/>
-                <w:spacing w:val="26"/>
+              <w:t>*</w:t>
+            </w:r>
+            <w:r>
+              <w:rPr>
+                <w:rFonts w:eastAsia="PingFang SC"/>
+                <w:spacing w:val="-1"/>
                 <w:position w:val="1"/>
+                <w:lang w:eastAsia="zh-CN"/>
               </w:rPr>
               <w:t xml:space="preserve"> </w:t>
             </w:r>
@@ -3316,18 +3316,18 @@
             </w:r>
             <w:r>
               <w:rPr>
-                <w:rFonts w:ascii="PingFang SC" w:eastAsia="PingFang SC" w:hAnsi="PingFang SC" w:cs="PingFang SC"/>
+                <w:rFonts w:ascii="Wingdings 2" w:eastAsia="PingFang SC" w:hAnsi="Wingdings 2" w:cs="PingFang SC"/>
                 <w:spacing w:val="-1"/>
                 <w:position w:val="1"/>
               </w:rPr>
-              <w:t>口</w:t>
-            </w:r>
-            <w:r>
-              <w:rPr>
-                <w:rFonts w:ascii="PingFang SC" w:eastAsia="PingFang SC" w:hAnsi="PingFang SC" w:cs="PingFang SC"/>
-                <w:spacing w:val="25"/>
-                <w:w w:val="101"/>
+              <w:t>*</w:t>
+            </w:r>
+            <w:r>
+              <w:rPr>
+                <w:rFonts w:eastAsia="PingFang SC"/>
+                <w:spacing w:val="-1"/>
                 <w:position w:val="1"/>
+                <w:lang w:eastAsia="zh-CN"/>
               </w:rPr>
               <w:t xml:space="preserve"> </w:t>
             </w:r>
@@ -3347,12 +3347,14 @@
         <w:tc>
           <w:tcPr>
             <w:tcW w:w="684" w:type="dxa"/>
+            <w:vAlign w:val="center"/>
           </w:tcPr>
           <w:p>
             <w:pPr>
               <w:pStyle w:val="TableText"/>
               <w:spacing w:before="164"/>
               <w:ind w:left="293"/>
+              <w:jc w:val="both"/>
             </w:pPr>
             <w:r>
               <w:t>7</w:t>
@@ -3363,62 +3365,36 @@
           <w:tcPr>
             <w:tcW w:w="9925" w:type="dxa"/>
             <w:gridSpan w:val="5"/>
+            <w:vAlign w:val="center"/>
           </w:tcPr>
           <w:p>
             <w:pPr>
               <w:pStyle w:val="TableText"/>
-              <w:spacing w:before="143" w:line="226" w:lineRule="exact"/>
+              <w:spacing w:before="143"/>
               <w:ind w:left="113"/>
               <w:rPr>
+                <w:rFonts w:hint="eastAsia"/>
                 <w:sz w:val="12"/>
                 <w:szCs w:val="12"/>
+                <w:lang w:eastAsia="zh-CN"/>
               </w:rPr>
             </w:pPr>
             <w:r>
               <w:rPr>
-                <w:noProof/>
-                <w:position w:val="-2"/>
-              </w:rPr>
-              <w:drawing>
-                <wp:inline distT="0" distB="0" distL="0" distR="0" wp14:anchorId="3512AD12" wp14:editId="07777777">
-                  <wp:extent cx="107950" cy="107950"/>
-                  <wp:effectExtent l="0" t="0" r="0" b="0"/>
-                  <wp:docPr id="6" name="IM 6"/>
-                  <wp:cNvGraphicFramePr/>
-                  <a:graphic xmlns:a="http://schemas.openxmlformats.org/drawingml/2006/main">
-                    <a:graphicData uri="http://schemas.openxmlformats.org/drawingml/2006/picture">
-                      <pic:pic xmlns:pic="http://schemas.openxmlformats.org/drawingml/2006/picture">
-                        <pic:nvPicPr>
-                          <pic:cNvPr id="6" name="IM 6"/>
-                          <pic:cNvPicPr/>
-                        </pic:nvPicPr>
-                        <pic:blipFill>
-                          <a:blip r:embed="rId7"/>
-                          <a:stretch>
-                            <a:fillRect/>
-                          </a:stretch>
-                        </pic:blipFill>
-                        <pic:spPr>
-                          <a:xfrm>
-                            <a:off x="0" y="0"/>
-                            <a:ext cx="107950" cy="107950"/>
-                          </a:xfrm>
-                          <a:prstGeom prst="rect">
-                            <a:avLst/>
-                          </a:prstGeom>
-                        </pic:spPr>
-                      </pic:pic>
-                    </a:graphicData>
-                  </a:graphic>
-                </wp:inline>
-              </w:drawing>
-            </w:r>
-            <w:r>
-              <w:rPr>
+                <w:rFonts w:ascii="Wingdings 2" w:hAnsi="Wingdings 2"/>
                 <w:spacing w:val="32"/>
                 <w:w w:val="101"/>
                 <w:position w:val="-2"/>
               </w:rPr>
+              <w:t>*</w:t>
+            </w:r>
+            <w:r>
+              <w:rPr>
+                <w:rFonts w:eastAsia="PingFang SC"/>
+                <w:spacing w:val="-1"/>
+                <w:position w:val="1"/>
+                <w:lang w:eastAsia="zh-CN"/>
+              </w:rPr>
               <w:t xml:space="preserve"> </w:t>
             </w:r>
             <w:r>
@@ -3436,8 +3412,10 @@
             </w:r>
             <w:r>
               <w:rPr>
-                <w:spacing w:val="36"/>
-                <w:position w:val="-2"/>
+                <w:rFonts w:eastAsia="PingFang SC"/>
+                <w:spacing w:val="-1"/>
+                <w:position w:val="1"/>
+                <w:lang w:eastAsia="zh-CN"/>
               </w:rPr>
               <w:t xml:space="preserve"> </w:t>
             </w:r>
@@ -5144,8 +5122,8 @@
       </w:r>
     </w:p>
     <w:sectPr>
-      <w:headerReference w:type="default" r:id="rId8"/>
-      <w:footerReference w:type="default" r:id="rId9"/>
+      <w:headerReference w:type="default" r:id="rId7"/>
+      <w:footerReference w:type="default" r:id="rId8"/>
       <w:pgSz w:w="11900" w:h="16840"/>
       <w:pgMar w:top="565" w:right="550" w:bottom="856" w:left="633" w:header="0" w:footer="706" w:gutter="0"/>
       <w:cols w:space="720"/>

</xml_diff>

<commit_message>
feat: enhance document generation with image support and signature handling
- Added support for embedding images in the document generation process using the docxtemplater-image-module-free.
- Implemented a function to generate signature images from a remote service, allowing for dynamic inclusion in generated documents.
- Updated the mergeDocxFiles function to handle image resources correctly, ensuring unique naming to avoid conflicts.
- Enhanced the generateIsccDocument function to accept and render signature images, improving the output quality of generated documents.
- Introduced caching for signature images to optimize performance and reduce redundant requests.
</commit_message>
<xml_diff>
--- a/template/ISCC.docx
+++ b/template/ISCC.docx
@@ -3373,7 +3373,6 @@
               <w:spacing w:before="143"/>
               <w:ind w:left="113"/>
               <w:rPr>
-                <w:rFonts w:hint="eastAsia"/>
                 <w:sz w:val="12"/>
                 <w:szCs w:val="12"/>
                 <w:lang w:eastAsia="zh-CN"/>
@@ -3984,6 +3983,95 @@
           <w:szCs w:val="18"/>
         </w:rPr>
       </w:pPr>
+      <w:r>
+        <w:rPr>
+          <w:noProof/>
+          <w:snapToGrid/>
+          <w:spacing w:val="-1"/>
+          <w:sz w:val="18"/>
+          <w:szCs w:val="18"/>
+        </w:rPr>
+        <mc:AlternateContent>
+          <mc:Choice Requires="wps">
+            <w:drawing>
+              <wp:anchor distT="0" distB="0" distL="114300" distR="114300" simplePos="0" relativeHeight="251661312" behindDoc="0" locked="0" layoutInCell="1" allowOverlap="1" wp14:anchorId="43667F07" wp14:editId="1223A863">
+                <wp:simplePos x="0" y="0"/>
+                <wp:positionH relativeFrom="column">
+                  <wp:posOffset>5262245</wp:posOffset>
+                </wp:positionH>
+                <wp:positionV relativeFrom="paragraph">
+                  <wp:posOffset>99060</wp:posOffset>
+                </wp:positionV>
+                <wp:extent cx="1625600" cy="444500"/>
+                <wp:effectExtent l="0" t="0" r="0" b="0"/>
+                <wp:wrapNone/>
+                <wp:docPr id="1887118971" name="文本框 3"/>
+                <wp:cNvGraphicFramePr/>
+                <a:graphic xmlns:a="http://schemas.openxmlformats.org/drawingml/2006/main">
+                  <a:graphicData uri="http://schemas.microsoft.com/office/word/2010/wordprocessingShape">
+                    <wps:wsp>
+                      <wps:cNvSpPr txBox="1"/>
+                      <wps:spPr>
+                        <a:xfrm>
+                          <a:off x="0" y="0"/>
+                          <a:ext cx="1625600" cy="444500"/>
+                        </a:xfrm>
+                        <a:prstGeom prst="rect">
+                          <a:avLst/>
+                        </a:prstGeom>
+                        <a:noFill/>
+                        <a:ln w="6350">
+                          <a:noFill/>
+                        </a:ln>
+                      </wps:spPr>
+                      <wps:txbx>
+                        <w:txbxContent>
+                          <w:p>
+                            <w:r>
+                              <w:t>{%signature}</w:t>
+                            </w:r>
+                          </w:p>
+                        </w:txbxContent>
+                      </wps:txbx>
+                      <wps:bodyPr rot="0" spcFirstLastPara="0" vertOverflow="overflow" horzOverflow="overflow" vert="horz" wrap="square" lIns="91440" tIns="45720" rIns="91440" bIns="45720" numCol="1" spcCol="0" rtlCol="0" fromWordArt="0" anchor="t" anchorCtr="0" forceAA="0" compatLnSpc="1">
+                        <a:prstTxWarp prst="textNoShape">
+                          <a:avLst/>
+                        </a:prstTxWarp>
+                        <a:noAutofit/>
+                      </wps:bodyPr>
+                    </wps:wsp>
+                  </a:graphicData>
+                </a:graphic>
+                <wp14:sizeRelH relativeFrom="margin">
+                  <wp14:pctWidth>0</wp14:pctWidth>
+                </wp14:sizeRelH>
+                <wp14:sizeRelV relativeFrom="margin">
+                  <wp14:pctHeight>0</wp14:pctHeight>
+                </wp14:sizeRelV>
+              </wp:anchor>
+            </w:drawing>
+          </mc:Choice>
+          <mc:Fallback>
+            <w:pict>
+              <v:shapetype w14:anchorId="43667F07" id="_x0000_t202" coordsize="21600,21600" o:spt="202" path="m,l,21600r21600,l21600,xe">
+                <v:stroke joinstyle="miter"/>
+                <v:path gradientshapeok="t" o:connecttype="rect"/>
+              </v:shapetype>
+              <v:shape id="文本框 3" o:spid="_x0000_s1026" type="#_x0000_t202" style="position:absolute;left:0;text-align:left;margin-left:414.35pt;margin-top:7.8pt;width:128pt;height:35pt;z-index:251661312;visibility:visible;mso-wrap-style:square;mso-width-percent:0;mso-height-percent:0;mso-wrap-distance-left:9pt;mso-wrap-distance-top:0;mso-wrap-distance-right:9pt;mso-wrap-distance-bottom:0;mso-position-horizontal:absolute;mso-position-horizontal-relative:text;mso-position-vertical:absolute;mso-position-vertical-relative:text;mso-width-percent:0;mso-height-percent:0;mso-width-relative:margin;mso-height-relative:margin;v-text-anchor:top" o:gfxdata="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" filled="f" stroked="f" strokeweight=".5pt">
+                <v:textbox>
+                  <w:txbxContent>
+                    <w:p>
+                      <w:r>
+                        <w:t>{%signature}</w:t>
+                      </w:r>
+                    </w:p>
+                  </w:txbxContent>
+                </v:textbox>
+              </v:shape>
+            </w:pict>
+          </mc:Fallback>
+        </mc:AlternateContent>
+      </w:r>
       <w:r>
         <w:rPr>
           <w:spacing w:val="-1"/>

</xml_diff>